<commit_message>
Describe the changes made
</commit_message>
<xml_diff>
--- a/EMMANUEL FEYISAYO CV.docx
+++ b/EMMANUEL FEYISAYO CV.docx
@@ -44,7 +44,25 @@
           <w:sz w:val="24"/>
           <w:szCs w:val="24"/>
         </w:rPr>
-        <w:t>Computer Science Student | Junior Full-Stack Developer</w:t>
+        <w:t>Computer Science Undergraduate | Full-Stack Developer</w:t>
+      </w:r>
+    </w:p>
+    <w:p>
+      <w:pPr>
+        <w:spacing w:before="100" w:beforeAutospacing="1" w:after="100" w:afterAutospacing="1" w:line="240" w:lineRule="auto"/>
+        <w:rPr>
+          <w:rFonts w:ascii="Times New Roman" w:eastAsia="Times New Roman" w:hAnsi="Times New Roman" w:cs="Times New Roman"/>
+          <w:sz w:val="24"/>
+          <w:szCs w:val="24"/>
+        </w:rPr>
+      </w:pPr>
+      <w:r>
+        <w:rPr>
+          <w:rFonts w:ascii="Times New Roman" w:eastAsia="Times New Roman" w:hAnsi="Times New Roman" w:cs="Times New Roman"/>
+          <w:sz w:val="24"/>
+          <w:szCs w:val="24"/>
+        </w:rPr>
+        <w:t>Building responsive web applications with JavaScript, Next.js, Node.js, and modern web technologies.</w:t>
       </w:r>
     </w:p>
     <w:p>
@@ -193,7 +211,10 @@
             <w:szCs w:val="24"/>
             <w:u w:val="single"/>
           </w:rPr>
-          <w:t>https://bck2-1.onrender.com</w:t>
+          <w:t>https://bck2-1.onrender.</w:t>
+        </w:r>
+        <w:r>
+          <w:t>com</w:t>
         </w:r>
       </w:hyperlink>
     </w:p>
@@ -219,8 +240,49 @@
     </w:p>
     <w:p>
       <w:pPr>
+        <w:pStyle w:val="pdq2pgselectionanchorcontainer"/>
+      </w:pPr>
+      <w:r>
+        <w:rPr>
+          <w:rStyle w:val="Strong"/>
+        </w:rPr>
+        <w:t>Professional Summary</w:t>
+      </w:r>
+    </w:p>
+    <w:p>
+      <w:pPr>
+        <w:pStyle w:val="NormalWeb"/>
+      </w:pPr>
+      <w:r>
+        <w:t>Computer Science undergraduate at Caleb University with practical experience building and deploying full-stack web applications using JavaScript, Next.js, HTML, CSS, REST APIs, Git, and Render. Passionate about creating scalable software, solving real-world problems, and continuously improving backend and frontend development skills. Seeking a Software Engineering Internship or Junior Full-Stack Developer position where I can contribute while learning from experienced engineers.</w:t>
+      </w:r>
+    </w:p>
+    <w:p>
+      <w:pPr>
+        <w:spacing w:after="0" w:line="240" w:lineRule="auto"/>
+        <w:rPr>
+          <w:rFonts w:ascii="Times New Roman" w:eastAsia="Times New Roman" w:hAnsi="Times New Roman" w:cs="Times New Roman"/>
+          <w:sz w:val="24"/>
+          <w:szCs w:val="24"/>
+        </w:rPr>
+      </w:pPr>
+      <w:r>
+        <w:rPr>
+          <w:rFonts w:ascii="Times New Roman" w:eastAsia="Times New Roman" w:hAnsi="Times New Roman" w:cs="Times New Roman"/>
+          <w:sz w:val="24"/>
+          <w:szCs w:val="24"/>
+        </w:rPr>
+        <w:pict w14:anchorId="0345BB7B">
+          <v:rect id="_x0000_i1026" style="width:0;height:1.5pt" o:hralign="center" o:hrstd="t" o:hr="t" fillcolor="#a0a0a0" stroked="f"/>
+        </w:pict>
+      </w:r>
+    </w:p>
+    <w:p>
+      <w:pPr>
         <w:spacing w:before="100" w:beforeAutospacing="1" w:after="100" w:afterAutospacing="1" w:line="240" w:lineRule="auto"/>
         <w:outlineLvl w:val="1"/>
+      </w:pPr>
+      <w:r>
         <w:rPr>
           <w:rFonts w:ascii="Times New Roman" w:eastAsia="Times New Roman" w:hAnsi="Times New Roman" w:cs="Times New Roman"/>
           <w:b/>
@@ -228,8 +290,375 @@
           <w:sz w:val="36"/>
           <w:szCs w:val="36"/>
         </w:rPr>
-      </w:pPr>
-      <w:r>
+        <w:t>TECHNICAL SKILLS</w:t>
+      </w:r>
+    </w:p>
+    <w:p>
+      <w:pPr>
+        <w:pStyle w:val="NormalWeb"/>
+      </w:pPr>
+      <w:r>
+        <w:rPr>
+          <w:rStyle w:val="Strong"/>
+        </w:rPr>
+        <w:t>Languages</w:t>
+      </w:r>
+    </w:p>
+    <w:p>
+      <w:pPr>
+        <w:numPr>
+          <w:ilvl w:val="0"/>
+          <w:numId w:val="7"/>
+        </w:numPr>
+        <w:spacing w:before="100" w:beforeAutospacing="1" w:after="100" w:afterAutospacing="1" w:line="240" w:lineRule="auto"/>
+      </w:pPr>
+      <w:r>
+        <w:t xml:space="preserve">JavaScript (ES6+) </w:t>
+      </w:r>
+    </w:p>
+    <w:p>
+      <w:pPr>
+        <w:numPr>
+          <w:ilvl w:val="0"/>
+          <w:numId w:val="7"/>
+        </w:numPr>
+        <w:spacing w:before="100" w:beforeAutospacing="1" w:after="100" w:afterAutospacing="1" w:line="240" w:lineRule="auto"/>
+      </w:pPr>
+      <w:r>
+        <w:t xml:space="preserve">HTML5 </w:t>
+      </w:r>
+    </w:p>
+    <w:p>
+      <w:pPr>
+        <w:numPr>
+          <w:ilvl w:val="0"/>
+          <w:numId w:val="7"/>
+        </w:numPr>
+        <w:spacing w:before="100" w:beforeAutospacing="1" w:after="100" w:afterAutospacing="1" w:line="240" w:lineRule="auto"/>
+      </w:pPr>
+      <w:r>
+        <w:t xml:space="preserve">CSS3 </w:t>
+      </w:r>
+    </w:p>
+    <w:p>
+      <w:pPr>
+        <w:numPr>
+          <w:ilvl w:val="0"/>
+          <w:numId w:val="7"/>
+        </w:numPr>
+        <w:spacing w:before="100" w:beforeAutospacing="1" w:after="100" w:afterAutospacing="1" w:line="240" w:lineRule="auto"/>
+      </w:pPr>
+      <w:r>
+        <w:t xml:space="preserve">SQL (if learning) </w:t>
+      </w:r>
+    </w:p>
+    <w:p>
+      <w:pPr>
+        <w:numPr>
+          <w:ilvl w:val="0"/>
+          <w:numId w:val="7"/>
+        </w:numPr>
+        <w:spacing w:before="100" w:beforeAutospacing="1" w:after="100" w:afterAutospacing="1" w:line="240" w:lineRule="auto"/>
+      </w:pPr>
+      <w:r>
+        <w:t xml:space="preserve">C# (once comfortable) </w:t>
+      </w:r>
+    </w:p>
+    <w:p>
+      <w:pPr>
+        <w:pStyle w:val="NormalWeb"/>
+      </w:pPr>
+      <w:r>
+        <w:rPr>
+          <w:rStyle w:val="Strong"/>
+        </w:rPr>
+        <w:t>Frontend</w:t>
+      </w:r>
+    </w:p>
+    <w:p>
+      <w:pPr>
+        <w:numPr>
+          <w:ilvl w:val="0"/>
+          <w:numId w:val="8"/>
+        </w:numPr>
+        <w:spacing w:before="100" w:beforeAutospacing="1" w:after="100" w:afterAutospacing="1" w:line="240" w:lineRule="auto"/>
+      </w:pPr>
+      <w:r>
+        <w:t xml:space="preserve">Next.js </w:t>
+      </w:r>
+    </w:p>
+    <w:p>
+      <w:pPr>
+        <w:numPr>
+          <w:ilvl w:val="0"/>
+          <w:numId w:val="8"/>
+        </w:numPr>
+        <w:spacing w:before="100" w:beforeAutospacing="1" w:after="100" w:afterAutospacing="1" w:line="240" w:lineRule="auto"/>
+      </w:pPr>
+      <w:r>
+        <w:t xml:space="preserve">Responsive Web Design </w:t>
+      </w:r>
+    </w:p>
+    <w:p>
+      <w:pPr>
+        <w:numPr>
+          <w:ilvl w:val="0"/>
+          <w:numId w:val="8"/>
+        </w:numPr>
+        <w:spacing w:before="100" w:beforeAutospacing="1" w:after="100" w:afterAutospacing="1" w:line="240" w:lineRule="auto"/>
+      </w:pPr>
+      <w:r>
+        <w:t xml:space="preserve">REST API Integration </w:t>
+      </w:r>
+    </w:p>
+    <w:p>
+      <w:pPr>
+        <w:numPr>
+          <w:ilvl w:val="0"/>
+          <w:numId w:val="8"/>
+        </w:numPr>
+        <w:spacing w:before="100" w:beforeAutospacing="1" w:after="100" w:afterAutospacing="1" w:line="240" w:lineRule="auto"/>
+      </w:pPr>
+      <w:r>
+        <w:t xml:space="preserve">DOM Manipulation </w:t>
+      </w:r>
+    </w:p>
+    <w:p>
+      <w:pPr>
+        <w:pStyle w:val="NormalWeb"/>
+        <w:rPr>
+          <w:rStyle w:val="Strong"/>
+        </w:rPr>
+      </w:pPr>
+    </w:p>
+    <w:p>
+      <w:pPr>
+        <w:pStyle w:val="NormalWeb"/>
+      </w:pPr>
+      <w:r>
+        <w:rPr>
+          <w:rStyle w:val="Strong"/>
+        </w:rPr>
+        <w:lastRenderedPageBreak/>
+        <w:t>Backend</w:t>
+      </w:r>
+    </w:p>
+    <w:p>
+      <w:pPr>
+        <w:numPr>
+          <w:ilvl w:val="0"/>
+          <w:numId w:val="9"/>
+        </w:numPr>
+        <w:spacing w:before="100" w:beforeAutospacing="1" w:after="100" w:afterAutospacing="1" w:line="240" w:lineRule="auto"/>
+      </w:pPr>
+      <w:r>
+        <w:t xml:space="preserve">Node.js </w:t>
+      </w:r>
+    </w:p>
+    <w:p>
+      <w:pPr>
+        <w:numPr>
+          <w:ilvl w:val="0"/>
+          <w:numId w:val="9"/>
+        </w:numPr>
+        <w:spacing w:before="100" w:beforeAutospacing="1" w:after="100" w:afterAutospacing="1" w:line="240" w:lineRule="auto"/>
+      </w:pPr>
+      <w:r>
+        <w:t xml:space="preserve">Express.js </w:t>
+      </w:r>
+    </w:p>
+    <w:p>
+      <w:pPr>
+        <w:numPr>
+          <w:ilvl w:val="0"/>
+          <w:numId w:val="9"/>
+        </w:numPr>
+        <w:spacing w:before="100" w:beforeAutospacing="1" w:after="100" w:afterAutospacing="1" w:line="240" w:lineRule="auto"/>
+      </w:pPr>
+      <w:r>
+        <w:t xml:space="preserve">REST APIs </w:t>
+      </w:r>
+    </w:p>
+    <w:p>
+      <w:pPr>
+        <w:numPr>
+          <w:ilvl w:val="0"/>
+          <w:numId w:val="9"/>
+        </w:numPr>
+        <w:spacing w:before="100" w:beforeAutospacing="1" w:after="100" w:afterAutospacing="1" w:line="240" w:lineRule="auto"/>
+      </w:pPr>
+      <w:r>
+        <w:t xml:space="preserve">Authentication (JWT) </w:t>
+      </w:r>
+    </w:p>
+    <w:p>
+      <w:pPr>
+        <w:numPr>
+          <w:ilvl w:val="0"/>
+          <w:numId w:val="9"/>
+        </w:numPr>
+        <w:spacing w:before="100" w:beforeAutospacing="1" w:after="100" w:afterAutospacing="1" w:line="240" w:lineRule="auto"/>
+      </w:pPr>
+      <w:r>
+        <w:t xml:space="preserve">CRUD Operations </w:t>
+      </w:r>
+    </w:p>
+    <w:p>
+      <w:pPr>
+        <w:pStyle w:val="NormalWeb"/>
+      </w:pPr>
+      <w:r>
+        <w:rPr>
+          <w:rStyle w:val="Strong"/>
+        </w:rPr>
+        <w:t>Database</w:t>
+      </w:r>
+    </w:p>
+    <w:p>
+      <w:pPr>
+        <w:numPr>
+          <w:ilvl w:val="0"/>
+          <w:numId w:val="10"/>
+        </w:numPr>
+        <w:spacing w:before="100" w:beforeAutospacing="1" w:after="100" w:afterAutospacing="1" w:line="240" w:lineRule="auto"/>
+      </w:pPr>
+      <w:r>
+        <w:t xml:space="preserve">PostgreSQL </w:t>
+      </w:r>
+    </w:p>
+    <w:p>
+      <w:pPr>
+        <w:numPr>
+          <w:ilvl w:val="0"/>
+          <w:numId w:val="10"/>
+        </w:numPr>
+        <w:spacing w:before="100" w:beforeAutospacing="1" w:after="100" w:afterAutospacing="1" w:line="240" w:lineRule="auto"/>
+      </w:pPr>
+      <w:r>
+        <w:t xml:space="preserve">Prisma ORM </w:t>
+      </w:r>
+    </w:p>
+    <w:p>
+      <w:pPr>
+        <w:numPr>
+          <w:ilvl w:val="0"/>
+          <w:numId w:val="10"/>
+        </w:numPr>
+        <w:spacing w:before="100" w:beforeAutospacing="1" w:after="100" w:afterAutospacing="1" w:line="240" w:lineRule="auto"/>
+      </w:pPr>
+      <w:r>
+        <w:t xml:space="preserve">MongoDB (if applicable) </w:t>
+      </w:r>
+    </w:p>
+    <w:p>
+      <w:pPr>
+        <w:pStyle w:val="NormalWeb"/>
+      </w:pPr>
+      <w:r>
+        <w:rPr>
+          <w:rStyle w:val="Strong"/>
+        </w:rPr>
+        <w:t>Tools</w:t>
+      </w:r>
+    </w:p>
+    <w:p>
+      <w:pPr>
+        <w:numPr>
+          <w:ilvl w:val="0"/>
+          <w:numId w:val="11"/>
+        </w:numPr>
+        <w:spacing w:before="100" w:beforeAutospacing="1" w:after="100" w:afterAutospacing="1" w:line="240" w:lineRule="auto"/>
+      </w:pPr>
+      <w:r>
+        <w:t xml:space="preserve">Git </w:t>
+      </w:r>
+    </w:p>
+    <w:p>
+      <w:pPr>
+        <w:numPr>
+          <w:ilvl w:val="0"/>
+          <w:numId w:val="11"/>
+        </w:numPr>
+        <w:spacing w:before="100" w:beforeAutospacing="1" w:after="100" w:afterAutospacing="1" w:line="240" w:lineRule="auto"/>
+      </w:pPr>
+      <w:r>
+        <w:t xml:space="preserve">GitHub </w:t>
+      </w:r>
+    </w:p>
+    <w:p>
+      <w:pPr>
+        <w:numPr>
+          <w:ilvl w:val="0"/>
+          <w:numId w:val="11"/>
+        </w:numPr>
+        <w:spacing w:before="100" w:beforeAutospacing="1" w:after="100" w:afterAutospacing="1" w:line="240" w:lineRule="auto"/>
+      </w:pPr>
+      <w:r>
+        <w:t xml:space="preserve">Render </w:t>
+      </w:r>
+    </w:p>
+    <w:p>
+      <w:pPr>
+        <w:numPr>
+          <w:ilvl w:val="0"/>
+          <w:numId w:val="11"/>
+        </w:numPr>
+        <w:spacing w:before="100" w:beforeAutospacing="1" w:after="100" w:afterAutospacing="1" w:line="240" w:lineRule="auto"/>
+      </w:pPr>
+      <w:r>
+        <w:t xml:space="preserve">VS Code </w:t>
+      </w:r>
+    </w:p>
+    <w:p>
+      <w:pPr>
+        <w:numPr>
+          <w:ilvl w:val="0"/>
+          <w:numId w:val="11"/>
+        </w:numPr>
+        <w:spacing w:before="100" w:beforeAutospacing="1" w:after="100" w:afterAutospacing="1" w:line="240" w:lineRule="auto"/>
+      </w:pPr>
+      <w:r>
+        <w:t xml:space="preserve">Postman </w:t>
+      </w:r>
+    </w:p>
+    <w:p>
+      <w:pPr>
+        <w:numPr>
+          <w:ilvl w:val="0"/>
+          <w:numId w:val="11"/>
+        </w:numPr>
+        <w:spacing w:before="100" w:beforeAutospacing="1" w:after="100" w:afterAutospacing="1" w:line="240" w:lineRule="auto"/>
+      </w:pPr>
+      <w:proofErr w:type="spellStart"/>
+      <w:r>
+        <w:t>Figma</w:t>
+      </w:r>
+      <w:proofErr w:type="spellEnd"/>
+    </w:p>
+    <w:p>
+      <w:pPr>
+        <w:spacing w:after="0" w:line="240" w:lineRule="auto"/>
+        <w:rPr>
+          <w:rFonts w:ascii="Times New Roman" w:eastAsia="Times New Roman" w:hAnsi="Times New Roman" w:cs="Times New Roman"/>
+          <w:sz w:val="24"/>
+          <w:szCs w:val="24"/>
+        </w:rPr>
+      </w:pPr>
+      <w:r>
+        <w:rPr>
+          <w:rFonts w:ascii="Times New Roman" w:eastAsia="Times New Roman" w:hAnsi="Times New Roman" w:cs="Times New Roman"/>
+          <w:sz w:val="24"/>
+          <w:szCs w:val="24"/>
+        </w:rPr>
+        <w:pict w14:anchorId="25361E20">
+          <v:rect id="_x0000_i1027" style="width:0;height:1.5pt" o:hralign="center" o:hrstd="t" o:hr="t" fillcolor="#a0a0a0" stroked="f"/>
+        </w:pict>
+      </w:r>
+    </w:p>
+    <w:p>
+      <w:pPr>
+        <w:spacing w:before="100" w:beforeAutospacing="1" w:after="100" w:afterAutospacing="1" w:line="240" w:lineRule="auto"/>
+        <w:outlineLvl w:val="1"/>
         <w:rPr>
           <w:rFonts w:ascii="Times New Roman" w:eastAsia="Times New Roman" w:hAnsi="Times New Roman" w:cs="Times New Roman"/>
           <w:b/>
@@ -237,87 +666,8 @@
           <w:sz w:val="36"/>
           <w:szCs w:val="36"/>
         </w:rPr>
-        <w:t>CAREER OBJECTIVE</w:t>
-      </w:r>
-    </w:p>
-    <w:p>
-      <w:pPr>
-        <w:spacing w:before="100" w:beforeAutospacing="1" w:after="100" w:afterAutospacing="1" w:line="240" w:lineRule="auto"/>
-        <w:rPr>
-          <w:rFonts w:ascii="Times New Roman" w:eastAsia="Times New Roman" w:hAnsi="Times New Roman" w:cs="Times New Roman"/>
-          <w:sz w:val="24"/>
-          <w:szCs w:val="24"/>
-        </w:rPr>
-      </w:pPr>
-      <w:r>
-        <w:rPr>
-          <w:rFonts w:ascii="Times New Roman" w:eastAsia="Times New Roman" w:hAnsi="Times New Roman" w:cs="Times New Roman"/>
-          <w:sz w:val="24"/>
-          <w:szCs w:val="24"/>
-        </w:rPr>
-        <w:t xml:space="preserve">Motivated Computer Science student at Caleb University seeking a </w:t>
-      </w:r>
-      <w:r>
-        <w:rPr>
-          <w:rFonts w:ascii="Times New Roman" w:eastAsia="Times New Roman" w:hAnsi="Times New Roman" w:cs="Times New Roman"/>
-          <w:b/>
-          <w:bCs/>
-          <w:sz w:val="24"/>
-          <w:szCs w:val="24"/>
-        </w:rPr>
-        <w:t>software development internship or junior full-stack role</w:t>
-      </w:r>
-      <w:r>
-        <w:rPr>
-          <w:rFonts w:ascii="Times New Roman" w:eastAsia="Times New Roman" w:hAnsi="Times New Roman" w:cs="Times New Roman"/>
-          <w:sz w:val="24"/>
-          <w:szCs w:val="24"/>
-        </w:rPr>
-        <w:t xml:space="preserve">. Hands-on experience in both frontend and backend development, including deploying backend services on </w:t>
-      </w:r>
-      <w:r>
-        <w:rPr>
-          <w:rFonts w:ascii="Times New Roman" w:eastAsia="Times New Roman" w:hAnsi="Times New Roman" w:cs="Times New Roman"/>
-          <w:b/>
-          <w:bCs/>
-          <w:sz w:val="24"/>
-          <w:szCs w:val="24"/>
-        </w:rPr>
-        <w:t>Render</w:t>
-      </w:r>
-      <w:r>
-        <w:rPr>
-          <w:rFonts w:ascii="Times New Roman" w:eastAsia="Times New Roman" w:hAnsi="Times New Roman" w:cs="Times New Roman"/>
-          <w:sz w:val="24"/>
-          <w:szCs w:val="24"/>
-        </w:rPr>
-        <w:t>. Passionate about learning, building scalable applications, and contributing to real-world software projects.</w:t>
-      </w:r>
-    </w:p>
-    <w:p>
-      <w:pPr>
-        <w:spacing w:after="0" w:line="240" w:lineRule="auto"/>
-        <w:rPr>
-          <w:rFonts w:ascii="Times New Roman" w:eastAsia="Times New Roman" w:hAnsi="Times New Roman" w:cs="Times New Roman"/>
-          <w:sz w:val="24"/>
-          <w:szCs w:val="24"/>
-        </w:rPr>
-      </w:pPr>
-      <w:r>
-        <w:rPr>
-          <w:rFonts w:ascii="Times New Roman" w:eastAsia="Times New Roman" w:hAnsi="Times New Roman" w:cs="Times New Roman"/>
-          <w:sz w:val="24"/>
-          <w:szCs w:val="24"/>
-        </w:rPr>
-        <w:pict w14:anchorId="0345BB7B">
-          <v:rect id="_x0000_i1026" style="width:0;height:1.5pt" o:hralign="center" o:hrstd="t" o:hr="t" fillcolor="#a0a0a0" stroked="f"/>
-        </w:pict>
-      </w:r>
-    </w:p>
-    <w:p>
-      <w:pPr>
-        <w:spacing w:before="100" w:beforeAutospacing="1" w:after="100" w:afterAutospacing="1" w:line="240" w:lineRule="auto"/>
-        <w:outlineLvl w:val="1"/>
+      </w:pPr>
+      <w:r>
         <w:rPr>
           <w:rFonts w:ascii="Times New Roman" w:eastAsia="Times New Roman" w:hAnsi="Times New Roman" w:cs="Times New Roman"/>
           <w:b/>
@@ -325,272 +675,6 @@
           <w:sz w:val="36"/>
           <w:szCs w:val="36"/>
         </w:rPr>
-      </w:pPr>
-      <w:r>
-        <w:rPr>
-          <w:rFonts w:ascii="Times New Roman" w:eastAsia="Times New Roman" w:hAnsi="Times New Roman" w:cs="Times New Roman"/>
-          <w:b/>
-          <w:bCs/>
-          <w:sz w:val="36"/>
-          <w:szCs w:val="36"/>
-        </w:rPr>
-        <w:t>TECHNICAL SKILLS</w:t>
-      </w:r>
-    </w:p>
-    <w:p>
-      <w:pPr>
-        <w:spacing w:before="100" w:beforeAutospacing="1" w:after="100" w:afterAutospacing="1" w:line="240" w:lineRule="auto"/>
-        <w:rPr>
-          <w:rFonts w:ascii="Times New Roman" w:eastAsia="Times New Roman" w:hAnsi="Times New Roman" w:cs="Times New Roman"/>
-          <w:sz w:val="24"/>
-          <w:szCs w:val="24"/>
-        </w:rPr>
-      </w:pPr>
-      <w:r>
-        <w:rPr>
-          <w:rFonts w:ascii="Times New Roman" w:eastAsia="Times New Roman" w:hAnsi="Times New Roman" w:cs="Times New Roman"/>
-          <w:b/>
-          <w:bCs/>
-          <w:sz w:val="24"/>
-          <w:szCs w:val="24"/>
-        </w:rPr>
-        <w:t>Frontend Development</w:t>
-      </w:r>
-    </w:p>
-    <w:p>
-      <w:pPr>
-        <w:numPr>
-          <w:ilvl w:val="0"/>
-          <w:numId w:val="1"/>
-        </w:numPr>
-        <w:spacing w:before="100" w:beforeAutospacing="1" w:after="100" w:afterAutospacing="1" w:line="240" w:lineRule="auto"/>
-        <w:rPr>
-          <w:rFonts w:ascii="Times New Roman" w:eastAsia="Times New Roman" w:hAnsi="Times New Roman" w:cs="Times New Roman"/>
-          <w:sz w:val="24"/>
-          <w:szCs w:val="24"/>
-        </w:rPr>
-      </w:pPr>
-      <w:r>
-        <w:rPr>
-          <w:rFonts w:ascii="Times New Roman" w:eastAsia="Times New Roman" w:hAnsi="Times New Roman" w:cs="Times New Roman"/>
-          <w:sz w:val="24"/>
-          <w:szCs w:val="24"/>
-        </w:rPr>
-        <w:t>HTML5, CSS3, JavaScript (ES6+), Next.js</w:t>
-      </w:r>
-      <w:bookmarkStart w:id="0" w:name="_GoBack"/>
-      <w:bookmarkEnd w:id="0"/>
-    </w:p>
-    <w:p>
-      <w:pPr>
-        <w:spacing w:before="100" w:beforeAutospacing="1" w:after="100" w:afterAutospacing="1" w:line="240" w:lineRule="auto"/>
-        <w:rPr>
-          <w:rFonts w:ascii="Times New Roman" w:eastAsia="Times New Roman" w:hAnsi="Times New Roman" w:cs="Times New Roman"/>
-          <w:sz w:val="24"/>
-          <w:szCs w:val="24"/>
-        </w:rPr>
-      </w:pPr>
-      <w:r>
-        <w:rPr>
-          <w:rFonts w:ascii="Times New Roman" w:eastAsia="Times New Roman" w:hAnsi="Times New Roman" w:cs="Times New Roman"/>
-          <w:b/>
-          <w:bCs/>
-          <w:sz w:val="24"/>
-          <w:szCs w:val="24"/>
-        </w:rPr>
-        <w:t>Backend Development</w:t>
-      </w:r>
-    </w:p>
-    <w:p>
-      <w:pPr>
-        <w:numPr>
-          <w:ilvl w:val="0"/>
-          <w:numId w:val="2"/>
-        </w:numPr>
-        <w:spacing w:before="100" w:beforeAutospacing="1" w:after="100" w:afterAutospacing="1" w:line="240" w:lineRule="auto"/>
-        <w:rPr>
-          <w:rFonts w:ascii="Times New Roman" w:eastAsia="Times New Roman" w:hAnsi="Times New Roman" w:cs="Times New Roman"/>
-          <w:sz w:val="24"/>
-          <w:szCs w:val="24"/>
-        </w:rPr>
-      </w:pPr>
-      <w:r>
-        <w:rPr>
-          <w:rFonts w:ascii="Times New Roman" w:eastAsia="Times New Roman" w:hAnsi="Times New Roman" w:cs="Times New Roman"/>
-          <w:sz w:val="24"/>
-          <w:szCs w:val="24"/>
-        </w:rPr>
-        <w:t>RESTful APIs</w:t>
-      </w:r>
-    </w:p>
-    <w:p>
-      <w:pPr>
-        <w:numPr>
-          <w:ilvl w:val="0"/>
-          <w:numId w:val="2"/>
-        </w:numPr>
-        <w:spacing w:before="100" w:beforeAutospacing="1" w:after="100" w:afterAutospacing="1" w:line="240" w:lineRule="auto"/>
-        <w:rPr>
-          <w:rFonts w:ascii="Times New Roman" w:eastAsia="Times New Roman" w:hAnsi="Times New Roman" w:cs="Times New Roman"/>
-          <w:sz w:val="24"/>
-          <w:szCs w:val="24"/>
-        </w:rPr>
-      </w:pPr>
-      <w:r>
-        <w:rPr>
-          <w:rFonts w:ascii="Times New Roman" w:eastAsia="Times New Roman" w:hAnsi="Times New Roman" w:cs="Times New Roman"/>
-          <w:sz w:val="24"/>
-          <w:szCs w:val="24"/>
-        </w:rPr>
-        <w:t>Server-side JavaScript</w:t>
-      </w:r>
-    </w:p>
-    <w:p>
-      <w:pPr>
-        <w:numPr>
-          <w:ilvl w:val="0"/>
-          <w:numId w:val="2"/>
-        </w:numPr>
-        <w:spacing w:before="100" w:beforeAutospacing="1" w:after="100" w:afterAutospacing="1" w:line="240" w:lineRule="auto"/>
-        <w:rPr>
-          <w:rFonts w:ascii="Times New Roman" w:eastAsia="Times New Roman" w:hAnsi="Times New Roman" w:cs="Times New Roman"/>
-          <w:sz w:val="24"/>
-          <w:szCs w:val="24"/>
-        </w:rPr>
-      </w:pPr>
-      <w:r>
-        <w:rPr>
-          <w:rFonts w:ascii="Times New Roman" w:eastAsia="Times New Roman" w:hAnsi="Times New Roman" w:cs="Times New Roman"/>
-          <w:sz w:val="24"/>
-          <w:szCs w:val="24"/>
-        </w:rPr>
-        <w:t xml:space="preserve">Backend deployment using </w:t>
-      </w:r>
-      <w:r>
-        <w:rPr>
-          <w:rFonts w:ascii="Times New Roman" w:eastAsia="Times New Roman" w:hAnsi="Times New Roman" w:cs="Times New Roman"/>
-          <w:b/>
-          <w:bCs/>
-          <w:sz w:val="24"/>
-          <w:szCs w:val="24"/>
-        </w:rPr>
-        <w:t>Render</w:t>
-      </w:r>
-    </w:p>
-    <w:p>
-      <w:pPr>
-        <w:spacing w:before="100" w:beforeAutospacing="1" w:after="100" w:afterAutospacing="1" w:line="240" w:lineRule="auto"/>
-        <w:rPr>
-          <w:rFonts w:ascii="Times New Roman" w:eastAsia="Times New Roman" w:hAnsi="Times New Roman" w:cs="Times New Roman"/>
-          <w:sz w:val="24"/>
-          <w:szCs w:val="24"/>
-        </w:rPr>
-      </w:pPr>
-      <w:r>
-        <w:rPr>
-          <w:rFonts w:ascii="Times New Roman" w:eastAsia="Times New Roman" w:hAnsi="Times New Roman" w:cs="Times New Roman"/>
-          <w:b/>
-          <w:bCs/>
-          <w:sz w:val="24"/>
-          <w:szCs w:val="24"/>
-        </w:rPr>
-        <w:t>Version Control &amp; Tools</w:t>
-      </w:r>
-    </w:p>
-    <w:p>
-      <w:pPr>
-        <w:numPr>
-          <w:ilvl w:val="0"/>
-          <w:numId w:val="3"/>
-        </w:numPr>
-        <w:spacing w:before="100" w:beforeAutospacing="1" w:after="100" w:afterAutospacing="1" w:line="240" w:lineRule="auto"/>
-        <w:rPr>
-          <w:rFonts w:ascii="Times New Roman" w:eastAsia="Times New Roman" w:hAnsi="Times New Roman" w:cs="Times New Roman"/>
-          <w:sz w:val="24"/>
-          <w:szCs w:val="24"/>
-        </w:rPr>
-      </w:pPr>
-      <w:r>
-        <w:rPr>
-          <w:rFonts w:ascii="Times New Roman" w:eastAsia="Times New Roman" w:hAnsi="Times New Roman" w:cs="Times New Roman"/>
-          <w:sz w:val="24"/>
-          <w:szCs w:val="24"/>
-        </w:rPr>
-        <w:t>Git, GitHub</w:t>
-      </w:r>
-    </w:p>
-    <w:p>
-      <w:pPr>
-        <w:numPr>
-          <w:ilvl w:val="0"/>
-          <w:numId w:val="3"/>
-        </w:numPr>
-        <w:spacing w:before="100" w:beforeAutospacing="1" w:after="100" w:afterAutospacing="1" w:line="240" w:lineRule="auto"/>
-        <w:rPr>
-          <w:rFonts w:ascii="Times New Roman" w:eastAsia="Times New Roman" w:hAnsi="Times New Roman" w:cs="Times New Roman"/>
-          <w:sz w:val="24"/>
-          <w:szCs w:val="24"/>
-        </w:rPr>
-      </w:pPr>
-      <w:r>
-        <w:rPr>
-          <w:rFonts w:ascii="Times New Roman" w:eastAsia="Times New Roman" w:hAnsi="Times New Roman" w:cs="Times New Roman"/>
-          <w:sz w:val="24"/>
-          <w:szCs w:val="24"/>
-        </w:rPr>
-        <w:t xml:space="preserve">VS Code, Browser </w:t>
-      </w:r>
-      <w:proofErr w:type="spellStart"/>
-      <w:r>
-        <w:rPr>
-          <w:rFonts w:ascii="Times New Roman" w:eastAsia="Times New Roman" w:hAnsi="Times New Roman" w:cs="Times New Roman"/>
-          <w:sz w:val="24"/>
-          <w:szCs w:val="24"/>
-        </w:rPr>
-        <w:t>DevTools</w:t>
-      </w:r>
-      <w:proofErr w:type="spellEnd"/>
-    </w:p>
-    <w:p>
-      <w:pPr>
-        <w:spacing w:after="0" w:line="240" w:lineRule="auto"/>
-        <w:rPr>
-          <w:rFonts w:ascii="Times New Roman" w:eastAsia="Times New Roman" w:hAnsi="Times New Roman" w:cs="Times New Roman"/>
-          <w:sz w:val="24"/>
-          <w:szCs w:val="24"/>
-        </w:rPr>
-      </w:pPr>
-      <w:r>
-        <w:rPr>
-          <w:rFonts w:ascii="Times New Roman" w:eastAsia="Times New Roman" w:hAnsi="Times New Roman" w:cs="Times New Roman"/>
-          <w:sz w:val="24"/>
-          <w:szCs w:val="24"/>
-        </w:rPr>
-        <w:pict w14:anchorId="25361E20">
-          <v:rect id="_x0000_i1027" style="width:0;height:1.5pt" o:hralign="center" o:hrstd="t" o:hr="t" fillcolor="#a0a0a0" stroked="f"/>
-        </w:pict>
-      </w:r>
-    </w:p>
-    <w:p>
-      <w:pPr>
-        <w:spacing w:before="100" w:beforeAutospacing="1" w:after="100" w:afterAutospacing="1" w:line="240" w:lineRule="auto"/>
-        <w:outlineLvl w:val="1"/>
-        <w:rPr>
-          <w:rFonts w:ascii="Times New Roman" w:eastAsia="Times New Roman" w:hAnsi="Times New Roman" w:cs="Times New Roman"/>
-          <w:b/>
-          <w:bCs/>
-          <w:sz w:val="36"/>
-          <w:szCs w:val="36"/>
-        </w:rPr>
-      </w:pPr>
-      <w:r>
-        <w:rPr>
-          <w:rFonts w:ascii="Times New Roman" w:eastAsia="Times New Roman" w:hAnsi="Times New Roman" w:cs="Times New Roman"/>
-          <w:b/>
-          <w:bCs/>
-          <w:sz w:val="36"/>
-          <w:szCs w:val="36"/>
-        </w:rPr>
         <w:t>PROJECT EXPERIENCE</w:t>
       </w:r>
     </w:p>
@@ -632,7 +716,6 @@
           <w:sz w:val="24"/>
           <w:szCs w:val="24"/>
         </w:rPr>
-        <w:lastRenderedPageBreak/>
         <w:t>🔗</w:t>
       </w:r>
       <w:r>
@@ -720,14 +803,14 @@
           <w:sz w:val="24"/>
           <w:szCs w:val="24"/>
         </w:rPr>
-        <w:t>Key Achievements:</w:t>
+        <w:t>Highlights</w:t>
       </w:r>
     </w:p>
     <w:p>
       <w:pPr>
         <w:numPr>
           <w:ilvl w:val="0"/>
-          <w:numId w:val="4"/>
+          <w:numId w:val="12"/>
         </w:numPr>
         <w:spacing w:before="100" w:beforeAutospacing="1" w:after="100" w:afterAutospacing="1" w:line="240" w:lineRule="auto"/>
         <w:rPr>
@@ -742,8 +825,172 @@
           <w:sz w:val="24"/>
           <w:szCs w:val="24"/>
         </w:rPr>
-        <w:t xml:space="preserve">Built responsive and interactive user interfaces using </w:t>
-      </w:r>
+        <w:t xml:space="preserve">Developed a responsive e-commerce application using modern JavaScript and Next.js. </w:t>
+      </w:r>
+    </w:p>
+    <w:p>
+      <w:pPr>
+        <w:numPr>
+          <w:ilvl w:val="0"/>
+          <w:numId w:val="12"/>
+        </w:numPr>
+        <w:spacing w:before="100" w:beforeAutospacing="1" w:after="100" w:afterAutospacing="1" w:line="240" w:lineRule="auto"/>
+        <w:rPr>
+          <w:rFonts w:ascii="Times New Roman" w:eastAsia="Times New Roman" w:hAnsi="Times New Roman" w:cs="Times New Roman"/>
+          <w:sz w:val="24"/>
+          <w:szCs w:val="24"/>
+        </w:rPr>
+      </w:pPr>
+      <w:r>
+        <w:rPr>
+          <w:rFonts w:ascii="Times New Roman" w:eastAsia="Times New Roman" w:hAnsi="Times New Roman" w:cs="Times New Roman"/>
+          <w:sz w:val="24"/>
+          <w:szCs w:val="24"/>
+        </w:rPr>
+        <w:t xml:space="preserve">Designed RESTful API endpoints for authentication and product management. </w:t>
+      </w:r>
+    </w:p>
+    <w:p>
+      <w:pPr>
+        <w:numPr>
+          <w:ilvl w:val="0"/>
+          <w:numId w:val="12"/>
+        </w:numPr>
+        <w:spacing w:before="100" w:beforeAutospacing="1" w:after="100" w:afterAutospacing="1" w:line="240" w:lineRule="auto"/>
+        <w:rPr>
+          <w:rFonts w:ascii="Times New Roman" w:eastAsia="Times New Roman" w:hAnsi="Times New Roman" w:cs="Times New Roman"/>
+          <w:sz w:val="24"/>
+          <w:szCs w:val="24"/>
+        </w:rPr>
+      </w:pPr>
+      <w:r>
+        <w:rPr>
+          <w:rFonts w:ascii="Times New Roman" w:eastAsia="Times New Roman" w:hAnsi="Times New Roman" w:cs="Times New Roman"/>
+          <w:sz w:val="24"/>
+          <w:szCs w:val="24"/>
+        </w:rPr>
+        <w:t xml:space="preserve">Implemented secure user authentication using JWT. </w:t>
+      </w:r>
+    </w:p>
+    <w:p>
+      <w:pPr>
+        <w:numPr>
+          <w:ilvl w:val="0"/>
+          <w:numId w:val="12"/>
+        </w:numPr>
+        <w:spacing w:before="100" w:beforeAutospacing="1" w:after="100" w:afterAutospacing="1" w:line="240" w:lineRule="auto"/>
+        <w:rPr>
+          <w:rFonts w:ascii="Times New Roman" w:eastAsia="Times New Roman" w:hAnsi="Times New Roman" w:cs="Times New Roman"/>
+          <w:sz w:val="24"/>
+          <w:szCs w:val="24"/>
+        </w:rPr>
+      </w:pPr>
+      <w:r>
+        <w:rPr>
+          <w:rFonts w:ascii="Times New Roman" w:eastAsia="Times New Roman" w:hAnsi="Times New Roman" w:cs="Times New Roman"/>
+          <w:sz w:val="24"/>
+          <w:szCs w:val="24"/>
+        </w:rPr>
+        <w:t xml:space="preserve">Connected frontend and backend through API integration. </w:t>
+      </w:r>
+    </w:p>
+    <w:p>
+      <w:pPr>
+        <w:numPr>
+          <w:ilvl w:val="0"/>
+          <w:numId w:val="12"/>
+        </w:numPr>
+        <w:spacing w:before="100" w:beforeAutospacing="1" w:after="100" w:afterAutospacing="1" w:line="240" w:lineRule="auto"/>
+        <w:rPr>
+          <w:rFonts w:ascii="Times New Roman" w:eastAsia="Times New Roman" w:hAnsi="Times New Roman" w:cs="Times New Roman"/>
+          <w:sz w:val="24"/>
+          <w:szCs w:val="24"/>
+        </w:rPr>
+      </w:pPr>
+      <w:r>
+        <w:rPr>
+          <w:rFonts w:ascii="Times New Roman" w:eastAsia="Times New Roman" w:hAnsi="Times New Roman" w:cs="Times New Roman"/>
+          <w:sz w:val="24"/>
+          <w:szCs w:val="24"/>
+        </w:rPr>
+        <w:t xml:space="preserve">Used Prisma ORM to manage database operations. </w:t>
+      </w:r>
+    </w:p>
+    <w:p>
+      <w:pPr>
+        <w:numPr>
+          <w:ilvl w:val="0"/>
+          <w:numId w:val="12"/>
+        </w:numPr>
+        <w:spacing w:before="100" w:beforeAutospacing="1" w:after="100" w:afterAutospacing="1" w:line="240" w:lineRule="auto"/>
+        <w:rPr>
+          <w:rFonts w:ascii="Times New Roman" w:eastAsia="Times New Roman" w:hAnsi="Times New Roman" w:cs="Times New Roman"/>
+          <w:sz w:val="24"/>
+          <w:szCs w:val="24"/>
+        </w:rPr>
+      </w:pPr>
+      <w:r>
+        <w:rPr>
+          <w:rFonts w:ascii="Times New Roman" w:eastAsia="Times New Roman" w:hAnsi="Times New Roman" w:cs="Times New Roman"/>
+          <w:sz w:val="24"/>
+          <w:szCs w:val="24"/>
+        </w:rPr>
+        <w:t xml:space="preserve">Deployed the application on Render. </w:t>
+      </w:r>
+    </w:p>
+    <w:p>
+      <w:pPr>
+        <w:numPr>
+          <w:ilvl w:val="0"/>
+          <w:numId w:val="12"/>
+        </w:numPr>
+        <w:spacing w:before="100" w:beforeAutospacing="1" w:after="100" w:afterAutospacing="1" w:line="240" w:lineRule="auto"/>
+        <w:rPr>
+          <w:rFonts w:ascii="Times New Roman" w:eastAsia="Times New Roman" w:hAnsi="Times New Roman" w:cs="Times New Roman"/>
+          <w:sz w:val="24"/>
+          <w:szCs w:val="24"/>
+        </w:rPr>
+      </w:pPr>
+      <w:r>
+        <w:rPr>
+          <w:rFonts w:ascii="Times New Roman" w:eastAsia="Times New Roman" w:hAnsi="Times New Roman" w:cs="Times New Roman"/>
+          <w:sz w:val="24"/>
+          <w:szCs w:val="24"/>
+        </w:rPr>
+        <w:t xml:space="preserve">Managed source code using Git and GitHub. </w:t>
+      </w:r>
+    </w:p>
+    <w:p>
+      <w:pPr>
+        <w:numPr>
+          <w:ilvl w:val="0"/>
+          <w:numId w:val="12"/>
+        </w:numPr>
+        <w:spacing w:before="100" w:beforeAutospacing="1" w:after="100" w:afterAutospacing="1" w:line="240" w:lineRule="auto"/>
+        <w:rPr>
+          <w:rFonts w:ascii="Times New Roman" w:eastAsia="Times New Roman" w:hAnsi="Times New Roman" w:cs="Times New Roman"/>
+          <w:sz w:val="24"/>
+          <w:szCs w:val="24"/>
+        </w:rPr>
+      </w:pPr>
+      <w:r>
+        <w:rPr>
+          <w:rFonts w:ascii="Times New Roman" w:eastAsia="Times New Roman" w:hAnsi="Times New Roman" w:cs="Times New Roman"/>
+          <w:sz w:val="24"/>
+          <w:szCs w:val="24"/>
+        </w:rPr>
+        <w:t xml:space="preserve">Applied responsive design principles for desktop and mobile devices. </w:t>
+      </w:r>
+    </w:p>
+    <w:p>
+      <w:pPr>
+        <w:spacing w:before="100" w:beforeAutospacing="1" w:after="100" w:afterAutospacing="1" w:line="240" w:lineRule="auto"/>
+        <w:rPr>
+          <w:rFonts w:ascii="Times New Roman" w:eastAsia="Times New Roman" w:hAnsi="Times New Roman" w:cs="Times New Roman"/>
+          <w:sz w:val="24"/>
+          <w:szCs w:val="24"/>
+        </w:rPr>
+      </w:pPr>
       <w:r>
         <w:rPr>
           <w:rFonts w:ascii="Times New Roman" w:eastAsia="Times New Roman" w:hAnsi="Times New Roman" w:cs="Times New Roman"/>
@@ -752,142 +999,7 @@
           <w:sz w:val="24"/>
           <w:szCs w:val="24"/>
         </w:rPr>
-        <w:t>HTML, CSS, JavaScript, and Next.js</w:t>
-      </w:r>
-    </w:p>
-    <w:p>
-      <w:pPr>
-        <w:numPr>
-          <w:ilvl w:val="0"/>
-          <w:numId w:val="4"/>
-        </w:numPr>
-        <w:spacing w:before="100" w:beforeAutospacing="1" w:after="100" w:afterAutospacing="1" w:line="240" w:lineRule="auto"/>
-        <w:rPr>
-          <w:rFonts w:ascii="Times New Roman" w:eastAsia="Times New Roman" w:hAnsi="Times New Roman" w:cs="Times New Roman"/>
-          <w:sz w:val="24"/>
-          <w:szCs w:val="24"/>
-        </w:rPr>
-      </w:pPr>
-      <w:r>
-        <w:rPr>
-          <w:rFonts w:ascii="Times New Roman" w:eastAsia="Times New Roman" w:hAnsi="Times New Roman" w:cs="Times New Roman"/>
-          <w:sz w:val="24"/>
-          <w:szCs w:val="24"/>
-        </w:rPr>
-        <w:t>Developed backend logic and API endpoints to handle application functionality</w:t>
-      </w:r>
-    </w:p>
-    <w:p>
-      <w:pPr>
-        <w:numPr>
-          <w:ilvl w:val="0"/>
-          <w:numId w:val="4"/>
-        </w:numPr>
-        <w:spacing w:before="100" w:beforeAutospacing="1" w:after="100" w:afterAutospacing="1" w:line="240" w:lineRule="auto"/>
-        <w:rPr>
-          <w:rFonts w:ascii="Times New Roman" w:eastAsia="Times New Roman" w:hAnsi="Times New Roman" w:cs="Times New Roman"/>
-          <w:sz w:val="24"/>
-          <w:szCs w:val="24"/>
-        </w:rPr>
-      </w:pPr>
-      <w:r>
-        <w:rPr>
-          <w:rFonts w:ascii="Times New Roman" w:eastAsia="Times New Roman" w:hAnsi="Times New Roman" w:cs="Times New Roman"/>
-          <w:sz w:val="24"/>
-          <w:szCs w:val="24"/>
-        </w:rPr>
-        <w:t xml:space="preserve">Deployed backend services on </w:t>
-      </w:r>
-      <w:r>
-        <w:rPr>
-          <w:rFonts w:ascii="Times New Roman" w:eastAsia="Times New Roman" w:hAnsi="Times New Roman" w:cs="Times New Roman"/>
-          <w:b/>
-          <w:bCs/>
-          <w:sz w:val="24"/>
-          <w:szCs w:val="24"/>
-        </w:rPr>
-        <w:t>Render</w:t>
-      </w:r>
-      <w:r>
-        <w:rPr>
-          <w:rFonts w:ascii="Times New Roman" w:eastAsia="Times New Roman" w:hAnsi="Times New Roman" w:cs="Times New Roman"/>
-          <w:sz w:val="24"/>
-          <w:szCs w:val="24"/>
-        </w:rPr>
-        <w:t>, ensuring availability and scalability</w:t>
-      </w:r>
-    </w:p>
-    <w:p>
-      <w:pPr>
-        <w:numPr>
-          <w:ilvl w:val="0"/>
-          <w:numId w:val="4"/>
-        </w:numPr>
-        <w:spacing w:before="100" w:beforeAutospacing="1" w:after="100" w:afterAutospacing="1" w:line="240" w:lineRule="auto"/>
-        <w:rPr>
-          <w:rFonts w:ascii="Times New Roman" w:eastAsia="Times New Roman" w:hAnsi="Times New Roman" w:cs="Times New Roman"/>
-          <w:sz w:val="24"/>
-          <w:szCs w:val="24"/>
-        </w:rPr>
-      </w:pPr>
-      <w:r>
-        <w:rPr>
-          <w:rFonts w:ascii="Times New Roman" w:eastAsia="Times New Roman" w:hAnsi="Times New Roman" w:cs="Times New Roman"/>
-          <w:sz w:val="24"/>
-          <w:szCs w:val="24"/>
-        </w:rPr>
-        <w:t>Integrated frontend with backend using API calls</w:t>
-      </w:r>
-    </w:p>
-    <w:p>
-      <w:pPr>
-        <w:numPr>
-          <w:ilvl w:val="0"/>
-          <w:numId w:val="4"/>
-        </w:numPr>
-        <w:spacing w:before="100" w:beforeAutospacing="1" w:after="100" w:afterAutospacing="1" w:line="240" w:lineRule="auto"/>
-        <w:rPr>
-          <w:rFonts w:ascii="Times New Roman" w:eastAsia="Times New Roman" w:hAnsi="Times New Roman" w:cs="Times New Roman"/>
-          <w:sz w:val="24"/>
-          <w:szCs w:val="24"/>
-        </w:rPr>
-      </w:pPr>
-      <w:r>
-        <w:rPr>
-          <w:rFonts w:ascii="Times New Roman" w:eastAsia="Times New Roman" w:hAnsi="Times New Roman" w:cs="Times New Roman"/>
-          <w:sz w:val="24"/>
-          <w:szCs w:val="24"/>
-        </w:rPr>
-        <w:t xml:space="preserve">Managed codebase and version control with </w:t>
-      </w:r>
-      <w:r>
-        <w:rPr>
-          <w:rFonts w:ascii="Times New Roman" w:eastAsia="Times New Roman" w:hAnsi="Times New Roman" w:cs="Times New Roman"/>
-          <w:b/>
-          <w:bCs/>
-          <w:sz w:val="24"/>
-          <w:szCs w:val="24"/>
-        </w:rPr>
-        <w:t>Git &amp; GitHub</w:t>
-      </w:r>
-    </w:p>
-    <w:p>
-      <w:pPr>
-        <w:spacing w:before="100" w:beforeAutospacing="1" w:after="100" w:afterAutospacing="1" w:line="240" w:lineRule="auto"/>
-        <w:rPr>
-          <w:rFonts w:ascii="Times New Roman" w:eastAsia="Times New Roman" w:hAnsi="Times New Roman" w:cs="Times New Roman"/>
-          <w:sz w:val="24"/>
-          <w:szCs w:val="24"/>
-        </w:rPr>
-      </w:pPr>
-      <w:r>
-        <w:rPr>
-          <w:rFonts w:ascii="Times New Roman" w:eastAsia="Times New Roman" w:hAnsi="Times New Roman" w:cs="Times New Roman"/>
-          <w:b/>
-          <w:bCs/>
-          <w:sz w:val="24"/>
-          <w:szCs w:val="24"/>
-        </w:rPr>
+        <w:lastRenderedPageBreak/>
         <w:t>Technologies Used:</w:t>
       </w:r>
       <w:r>
@@ -1003,32 +1115,6 @@
           <w:sz w:val="24"/>
           <w:szCs w:val="24"/>
         </w:rPr>
-        <w:t>Status:</w:t>
-      </w:r>
-      <w:r>
-        <w:rPr>
-          <w:rFonts w:ascii="Times New Roman" w:eastAsia="Times New Roman" w:hAnsi="Times New Roman" w:cs="Times New Roman"/>
-          <w:sz w:val="24"/>
-          <w:szCs w:val="24"/>
-        </w:rPr>
-        <w:t xml:space="preserve"> Undergraduate Student</w:t>
-      </w:r>
-      <w:r>
-        <w:rPr>
-          <w:rFonts w:ascii="Times New Roman" w:eastAsia="Times New Roman" w:hAnsi="Times New Roman" w:cs="Times New Roman"/>
-          <w:sz w:val="24"/>
-          <w:szCs w:val="24"/>
-        </w:rPr>
-        <w:br/>
-      </w:r>
-      <w:r>
-        <w:rPr>
-          <w:rFonts w:ascii="Times New Roman" w:eastAsia="Times New Roman" w:hAnsi="Times New Roman" w:cs="Times New Roman"/>
-          <w:i/>
-          <w:iCs/>
-          <w:sz w:val="24"/>
-          <w:szCs w:val="24"/>
-        </w:rPr>
         <w:t>Expected Graduation:</w:t>
       </w:r>
       <w:r>
@@ -1093,116 +1179,6 @@
     </w:p>
     <w:p>
       <w:pPr>
-        <w:numPr>
-          <w:ilvl w:val="0"/>
-          <w:numId w:val="5"/>
-        </w:numPr>
-        <w:spacing w:before="100" w:beforeAutospacing="1" w:after="100" w:afterAutospacing="1" w:line="240" w:lineRule="auto"/>
-        <w:rPr>
-          <w:rFonts w:ascii="Times New Roman" w:eastAsia="Times New Roman" w:hAnsi="Times New Roman" w:cs="Times New Roman"/>
-          <w:sz w:val="24"/>
-          <w:szCs w:val="24"/>
-        </w:rPr>
-      </w:pPr>
-      <w:r>
-        <w:rPr>
-          <w:rFonts w:ascii="Times New Roman" w:eastAsia="Times New Roman" w:hAnsi="Times New Roman" w:cs="Times New Roman"/>
-          <w:sz w:val="24"/>
-          <w:szCs w:val="24"/>
-        </w:rPr>
-        <w:t>Problem Solving</w:t>
-      </w:r>
-    </w:p>
-    <w:p>
-      <w:pPr>
-        <w:numPr>
-          <w:ilvl w:val="0"/>
-          <w:numId w:val="5"/>
-        </w:numPr>
-        <w:spacing w:before="100" w:beforeAutospacing="1" w:after="100" w:afterAutospacing="1" w:line="240" w:lineRule="auto"/>
-        <w:rPr>
-          <w:rFonts w:ascii="Times New Roman" w:eastAsia="Times New Roman" w:hAnsi="Times New Roman" w:cs="Times New Roman"/>
-          <w:sz w:val="24"/>
-          <w:szCs w:val="24"/>
-        </w:rPr>
-      </w:pPr>
-      <w:r>
-        <w:rPr>
-          <w:rFonts w:ascii="Times New Roman" w:eastAsia="Times New Roman" w:hAnsi="Times New Roman" w:cs="Times New Roman"/>
-          <w:sz w:val="24"/>
-          <w:szCs w:val="24"/>
-        </w:rPr>
-        <w:t>Team Collaboration</w:t>
-      </w:r>
-    </w:p>
-    <w:p>
-      <w:pPr>
-        <w:numPr>
-          <w:ilvl w:val="0"/>
-          <w:numId w:val="5"/>
-        </w:numPr>
-        <w:spacing w:before="100" w:beforeAutospacing="1" w:after="100" w:afterAutospacing="1" w:line="240" w:lineRule="auto"/>
-        <w:rPr>
-          <w:rFonts w:ascii="Times New Roman" w:eastAsia="Times New Roman" w:hAnsi="Times New Roman" w:cs="Times New Roman"/>
-          <w:sz w:val="24"/>
-          <w:szCs w:val="24"/>
-        </w:rPr>
-      </w:pPr>
-      <w:r>
-        <w:rPr>
-          <w:rFonts w:ascii="Times New Roman" w:eastAsia="Times New Roman" w:hAnsi="Times New Roman" w:cs="Times New Roman"/>
-          <w:sz w:val="24"/>
-          <w:szCs w:val="24"/>
-        </w:rPr>
-        <w:t>Effective Communication</w:t>
-      </w:r>
-    </w:p>
-    <w:p>
-      <w:pPr>
-        <w:numPr>
-          <w:ilvl w:val="0"/>
-          <w:numId w:val="5"/>
-        </w:numPr>
-        <w:spacing w:before="100" w:beforeAutospacing="1" w:after="100" w:afterAutospacing="1" w:line="240" w:lineRule="auto"/>
-        <w:rPr>
-          <w:rFonts w:ascii="Times New Roman" w:eastAsia="Times New Roman" w:hAnsi="Times New Roman" w:cs="Times New Roman"/>
-          <w:sz w:val="24"/>
-          <w:szCs w:val="24"/>
-        </w:rPr>
-      </w:pPr>
-      <w:r>
-        <w:rPr>
-          <w:rFonts w:ascii="Times New Roman" w:eastAsia="Times New Roman" w:hAnsi="Times New Roman" w:cs="Times New Roman"/>
-          <w:sz w:val="24"/>
-          <w:szCs w:val="24"/>
-        </w:rPr>
-        <w:t>Time Management</w:t>
-      </w:r>
-    </w:p>
-    <w:p>
-      <w:pPr>
-        <w:numPr>
-          <w:ilvl w:val="0"/>
-          <w:numId w:val="5"/>
-        </w:numPr>
-        <w:spacing w:before="100" w:beforeAutospacing="1" w:after="100" w:afterAutospacing="1" w:line="240" w:lineRule="auto"/>
-        <w:rPr>
-          <w:rFonts w:ascii="Times New Roman" w:eastAsia="Times New Roman" w:hAnsi="Times New Roman" w:cs="Times New Roman"/>
-          <w:sz w:val="24"/>
-          <w:szCs w:val="24"/>
-        </w:rPr>
-      </w:pPr>
-      <w:r>
-        <w:rPr>
-          <w:rFonts w:ascii="Times New Roman" w:eastAsia="Times New Roman" w:hAnsi="Times New Roman" w:cs="Times New Roman"/>
-          <w:sz w:val="24"/>
-          <w:szCs w:val="24"/>
-        </w:rPr>
-        <w:t>Adaptability &amp; Fast Learner</w:t>
-      </w:r>
-    </w:p>
-    <w:p>
-      <w:pPr>
         <w:spacing w:after="0" w:line="240" w:lineRule="auto"/>
         <w:rPr>
           <w:rFonts w:ascii="Times New Roman" w:eastAsia="Times New Roman" w:hAnsi="Times New Roman" w:cs="Times New Roman"/>
@@ -1210,6 +1186,126 @@
           <w:szCs w:val="24"/>
         </w:rPr>
       </w:pPr>
+      <w:r>
+        <w:rPr>
+          <w:rFonts w:ascii="Times New Roman" w:eastAsia="Times New Roman" w:hAnsi="Symbol" w:cs="Times New Roman"/>
+          <w:sz w:val="24"/>
+          <w:szCs w:val="24"/>
+        </w:rPr>
+        <w:t></w:t>
+      </w:r>
+      <w:r>
+        <w:rPr>
+          <w:rFonts w:ascii="Times New Roman" w:eastAsia="Times New Roman" w:hAnsi="Times New Roman" w:cs="Times New Roman"/>
+          <w:sz w:val="24"/>
+          <w:szCs w:val="24"/>
+        </w:rPr>
+        <w:t xml:space="preserve"> Problem Solving </w:t>
+      </w:r>
+    </w:p>
+    <w:p>
+      <w:pPr>
+        <w:spacing w:after="0" w:line="240" w:lineRule="auto"/>
+        <w:rPr>
+          <w:rFonts w:ascii="Times New Roman" w:eastAsia="Times New Roman" w:hAnsi="Times New Roman" w:cs="Times New Roman"/>
+          <w:sz w:val="24"/>
+          <w:szCs w:val="24"/>
+        </w:rPr>
+      </w:pPr>
+      <w:r>
+        <w:rPr>
+          <w:rFonts w:ascii="Times New Roman" w:eastAsia="Times New Roman" w:hAnsi="Symbol" w:cs="Times New Roman"/>
+          <w:sz w:val="24"/>
+          <w:szCs w:val="24"/>
+        </w:rPr>
+        <w:t></w:t>
+      </w:r>
+      <w:r>
+        <w:rPr>
+          <w:rFonts w:ascii="Times New Roman" w:eastAsia="Times New Roman" w:hAnsi="Times New Roman" w:cs="Times New Roman"/>
+          <w:sz w:val="24"/>
+          <w:szCs w:val="24"/>
+        </w:rPr>
+        <w:t xml:space="preserve"> Communication </w:t>
+      </w:r>
+    </w:p>
+    <w:p>
+      <w:pPr>
+        <w:spacing w:after="0" w:line="240" w:lineRule="auto"/>
+        <w:rPr>
+          <w:rFonts w:ascii="Times New Roman" w:eastAsia="Times New Roman" w:hAnsi="Times New Roman" w:cs="Times New Roman"/>
+          <w:sz w:val="24"/>
+          <w:szCs w:val="24"/>
+        </w:rPr>
+      </w:pPr>
+      <w:r>
+        <w:rPr>
+          <w:rFonts w:ascii="Times New Roman" w:eastAsia="Times New Roman" w:hAnsi="Symbol" w:cs="Times New Roman"/>
+          <w:sz w:val="24"/>
+          <w:szCs w:val="24"/>
+        </w:rPr>
+        <w:t></w:t>
+      </w:r>
+      <w:r>
+        <w:rPr>
+          <w:rFonts w:ascii="Times New Roman" w:eastAsia="Times New Roman" w:hAnsi="Times New Roman" w:cs="Times New Roman"/>
+          <w:sz w:val="24"/>
+          <w:szCs w:val="24"/>
+        </w:rPr>
+        <w:t xml:space="preserve"> Team Collaboration </w:t>
+      </w:r>
+    </w:p>
+    <w:p>
+      <w:pPr>
+        <w:spacing w:after="0" w:line="240" w:lineRule="auto"/>
+        <w:rPr>
+          <w:rFonts w:ascii="Times New Roman" w:eastAsia="Times New Roman" w:hAnsi="Times New Roman" w:cs="Times New Roman"/>
+          <w:sz w:val="24"/>
+          <w:szCs w:val="24"/>
+        </w:rPr>
+      </w:pPr>
+      <w:r>
+        <w:rPr>
+          <w:rFonts w:ascii="Times New Roman" w:eastAsia="Times New Roman" w:hAnsi="Symbol" w:cs="Times New Roman"/>
+          <w:sz w:val="24"/>
+          <w:szCs w:val="24"/>
+        </w:rPr>
+        <w:t></w:t>
+      </w:r>
+      <w:r>
+        <w:rPr>
+          <w:rFonts w:ascii="Times New Roman" w:eastAsia="Times New Roman" w:hAnsi="Times New Roman" w:cs="Times New Roman"/>
+          <w:sz w:val="24"/>
+          <w:szCs w:val="24"/>
+        </w:rPr>
+        <w:t xml:space="preserve"> Adaptability </w:t>
+      </w:r>
+    </w:p>
+    <w:p>
+      <w:pPr>
+        <w:spacing w:after="0" w:line="240" w:lineRule="auto"/>
+        <w:rPr>
+          <w:rFonts w:ascii="Times New Roman" w:eastAsia="Times New Roman" w:hAnsi="Times New Roman" w:cs="Times New Roman"/>
+          <w:sz w:val="24"/>
+          <w:szCs w:val="24"/>
+        </w:rPr>
+      </w:pPr>
+      <w:r>
+        <w:rPr>
+          <w:rFonts w:ascii="Times New Roman" w:eastAsia="Times New Roman" w:hAnsi="Symbol" w:cs="Times New Roman"/>
+          <w:sz w:val="24"/>
+          <w:szCs w:val="24"/>
+        </w:rPr>
+        <w:t></w:t>
+      </w:r>
+      <w:r>
+        <w:rPr>
+          <w:rFonts w:ascii="Times New Roman" w:eastAsia="Times New Roman" w:hAnsi="Times New Roman" w:cs="Times New Roman"/>
+          <w:sz w:val="24"/>
+          <w:szCs w:val="24"/>
+        </w:rPr>
+        <w:t xml:space="preserve"> Continuous Learning</w:t>
+      </w:r>
       <w:r>
         <w:rPr>
           <w:rFonts w:ascii="Times New Roman" w:eastAsia="Times New Roman" w:hAnsi="Times New Roman" w:cs="Times New Roman"/>
@@ -1223,104 +1319,92 @@
     </w:p>
     <w:p>
       <w:pPr>
-        <w:spacing w:before="100" w:beforeAutospacing="1" w:after="100" w:afterAutospacing="1" w:line="240" w:lineRule="auto"/>
-        <w:outlineLvl w:val="1"/>
-        <w:rPr>
-          <w:rFonts w:ascii="Times New Roman" w:eastAsia="Times New Roman" w:hAnsi="Times New Roman" w:cs="Times New Roman"/>
-          <w:b/>
-          <w:bCs/>
-          <w:sz w:val="36"/>
-          <w:szCs w:val="36"/>
-        </w:rPr>
-      </w:pPr>
-      <w:r>
-        <w:rPr>
-          <w:rFonts w:ascii="Times New Roman" w:eastAsia="Times New Roman" w:hAnsi="Times New Roman" w:cs="Times New Roman"/>
-          <w:b/>
-          <w:bCs/>
-          <w:sz w:val="36"/>
-          <w:szCs w:val="36"/>
-        </w:rPr>
-        <w:t>ADDITIONAL INFORMATION</w:t>
+        <w:pStyle w:val="Heading2"/>
+      </w:pPr>
+      <w:bookmarkStart w:id="0" w:name="_GoBack"/>
+      <w:bookmarkEnd w:id="0"/>
+      <w:r>
+        <w:t>Interests</w:t>
       </w:r>
     </w:p>
     <w:p>
       <w:pPr>
         <w:numPr>
           <w:ilvl w:val="0"/>
-          <w:numId w:val="6"/>
+          <w:numId w:val="13"/>
         </w:numPr>
         <w:spacing w:before="100" w:beforeAutospacing="1" w:after="100" w:afterAutospacing="1" w:line="240" w:lineRule="auto"/>
-        <w:rPr>
-          <w:rFonts w:ascii="Times New Roman" w:eastAsia="Times New Roman" w:hAnsi="Times New Roman" w:cs="Times New Roman"/>
-          <w:sz w:val="24"/>
-          <w:szCs w:val="24"/>
-        </w:rPr>
-      </w:pPr>
-      <w:r>
-        <w:rPr>
-          <w:rFonts w:ascii="Times New Roman" w:eastAsia="Times New Roman" w:hAnsi="Times New Roman" w:cs="Times New Roman"/>
-          <w:sz w:val="24"/>
-          <w:szCs w:val="24"/>
-        </w:rPr>
-        <w:t xml:space="preserve">Experience deploying backend services to the cloud using </w:t>
-      </w:r>
-      <w:r>
-        <w:rPr>
-          <w:rFonts w:ascii="Times New Roman" w:eastAsia="Times New Roman" w:hAnsi="Times New Roman" w:cs="Times New Roman"/>
-          <w:b/>
-          <w:bCs/>
-          <w:sz w:val="24"/>
-          <w:szCs w:val="24"/>
-        </w:rPr>
-        <w:t>Render</w:t>
+      </w:pPr>
+      <w:r>
+        <w:t xml:space="preserve">Full-Stack Development </w:t>
       </w:r>
     </w:p>
     <w:p>
       <w:pPr>
         <w:numPr>
           <w:ilvl w:val="0"/>
-          <w:numId w:val="6"/>
+          <w:numId w:val="13"/>
         </w:numPr>
         <w:spacing w:before="100" w:beforeAutospacing="1" w:after="100" w:afterAutospacing="1" w:line="240" w:lineRule="auto"/>
-        <w:rPr>
-          <w:rFonts w:ascii="Times New Roman" w:eastAsia="Times New Roman" w:hAnsi="Times New Roman" w:cs="Times New Roman"/>
-          <w:sz w:val="24"/>
-          <w:szCs w:val="24"/>
-        </w:rPr>
-      </w:pPr>
-      <w:r>
-        <w:rPr>
-          <w:rFonts w:ascii="Times New Roman" w:eastAsia="Times New Roman" w:hAnsi="Times New Roman" w:cs="Times New Roman"/>
-          <w:sz w:val="24"/>
-          <w:szCs w:val="24"/>
-        </w:rPr>
-        <w:t>Actively improving backend and full-stack development skills</w:t>
+      </w:pPr>
+      <w:r>
+        <w:t xml:space="preserve">Backend Engineering </w:t>
       </w:r>
     </w:p>
     <w:p>
       <w:pPr>
         <w:numPr>
           <w:ilvl w:val="0"/>
-          <w:numId w:val="6"/>
+          <w:numId w:val="13"/>
         </w:numPr>
         <w:spacing w:before="100" w:beforeAutospacing="1" w:after="100" w:afterAutospacing="1" w:line="240" w:lineRule="auto"/>
-        <w:rPr>
-          <w:rFonts w:ascii="Times New Roman" w:eastAsia="Times New Roman" w:hAnsi="Times New Roman" w:cs="Times New Roman"/>
-          <w:sz w:val="24"/>
-          <w:szCs w:val="24"/>
-        </w:rPr>
-      </w:pPr>
-      <w:r>
-        <w:rPr>
-          <w:rFonts w:ascii="Times New Roman" w:eastAsia="Times New Roman" w:hAnsi="Times New Roman" w:cs="Times New Roman"/>
-          <w:sz w:val="24"/>
-          <w:szCs w:val="24"/>
-        </w:rPr>
-        <w:t>Strong interest in full-stack engineering and software development internships</w:t>
-      </w:r>
-    </w:p>
-    <w:p/>
+      </w:pPr>
+      <w:r>
+        <w:t xml:space="preserve">Software Architecture </w:t>
+      </w:r>
+    </w:p>
+    <w:p>
+      <w:pPr>
+        <w:numPr>
+          <w:ilvl w:val="0"/>
+          <w:numId w:val="13"/>
+        </w:numPr>
+        <w:spacing w:before="100" w:beforeAutospacing="1" w:after="100" w:afterAutospacing="1" w:line="240" w:lineRule="auto"/>
+      </w:pPr>
+      <w:r>
+        <w:t xml:space="preserve">Cloud Deployment </w:t>
+      </w:r>
+    </w:p>
+    <w:p>
+      <w:pPr>
+        <w:numPr>
+          <w:ilvl w:val="0"/>
+          <w:numId w:val="13"/>
+        </w:numPr>
+        <w:spacing w:before="100" w:beforeAutospacing="1" w:after="100" w:afterAutospacing="1" w:line="240" w:lineRule="auto"/>
+      </w:pPr>
+      <w:r>
+        <w:t xml:space="preserve">Open Source </w:t>
+      </w:r>
+    </w:p>
+    <w:p>
+      <w:pPr>
+        <w:numPr>
+          <w:ilvl w:val="0"/>
+          <w:numId w:val="13"/>
+        </w:numPr>
+        <w:spacing w:before="100" w:beforeAutospacing="1" w:after="100" w:afterAutospacing="1" w:line="240" w:lineRule="auto"/>
+      </w:pPr>
+      <w:r>
+        <w:t xml:space="preserve">Cybersecurity </w:t>
+      </w:r>
+    </w:p>
+    <w:p>
+      <w:pPr>
+        <w:spacing w:before="100" w:beforeAutospacing="1" w:after="100" w:afterAutospacing="1" w:line="240" w:lineRule="auto"/>
+        <w:outlineLvl w:val="1"/>
+      </w:pPr>
+    </w:p>
     <w:sectPr>
       <w:pgSz w:w="12240" w:h="15840"/>
       <w:pgMar w:top="1440" w:right="1440" w:bottom="1440" w:left="1440" w:header="720" w:footer="720" w:gutter="0"/>
@@ -1781,6 +1865,453 @@
     </w:lvl>
   </w:abstractNum>
   <w:abstractNum w:abstractNumId="3" w15:restartNumberingAfterBreak="0">
+    <w:nsid w:val="0E686539"/>
+    <w:multiLevelType w:val="multilevel"/>
+    <w:tmpl w:val="0BF28238"/>
+    <w:lvl w:ilvl="0">
+      <w:start w:val="1"/>
+      <w:numFmt w:val="bullet"/>
+      <w:lvlText w:val=""/>
+      <w:lvlJc w:val="left"/>
+      <w:pPr>
+        <w:tabs>
+          <w:tab w:val="num" w:pos="720"/>
+        </w:tabs>
+        <w:ind w:left="720" w:hanging="360"/>
+      </w:pPr>
+      <w:rPr>
+        <w:rFonts w:ascii="Symbol" w:hAnsi="Symbol" w:hint="default"/>
+        <w:sz w:val="20"/>
+      </w:rPr>
+    </w:lvl>
+    <w:lvl w:ilvl="1" w:tentative="1">
+      <w:start w:val="1"/>
+      <w:numFmt w:val="bullet"/>
+      <w:lvlText w:val="o"/>
+      <w:lvlJc w:val="left"/>
+      <w:pPr>
+        <w:tabs>
+          <w:tab w:val="num" w:pos="1440"/>
+        </w:tabs>
+        <w:ind w:left="1440" w:hanging="360"/>
+      </w:pPr>
+      <w:rPr>
+        <w:rFonts w:ascii="Courier New" w:hAnsi="Courier New" w:hint="default"/>
+        <w:sz w:val="20"/>
+      </w:rPr>
+    </w:lvl>
+    <w:lvl w:ilvl="2" w:tentative="1">
+      <w:start w:val="1"/>
+      <w:numFmt w:val="bullet"/>
+      <w:lvlText w:val=""/>
+      <w:lvlJc w:val="left"/>
+      <w:pPr>
+        <w:tabs>
+          <w:tab w:val="num" w:pos="2160"/>
+        </w:tabs>
+        <w:ind w:left="2160" w:hanging="360"/>
+      </w:pPr>
+      <w:rPr>
+        <w:rFonts w:ascii="Wingdings" w:hAnsi="Wingdings" w:hint="default"/>
+        <w:sz w:val="20"/>
+      </w:rPr>
+    </w:lvl>
+    <w:lvl w:ilvl="3" w:tentative="1">
+      <w:start w:val="1"/>
+      <w:numFmt w:val="bullet"/>
+      <w:lvlText w:val=""/>
+      <w:lvlJc w:val="left"/>
+      <w:pPr>
+        <w:tabs>
+          <w:tab w:val="num" w:pos="2880"/>
+        </w:tabs>
+        <w:ind w:left="2880" w:hanging="360"/>
+      </w:pPr>
+      <w:rPr>
+        <w:rFonts w:ascii="Wingdings" w:hAnsi="Wingdings" w:hint="default"/>
+        <w:sz w:val="20"/>
+      </w:rPr>
+    </w:lvl>
+    <w:lvl w:ilvl="4" w:tentative="1">
+      <w:start w:val="1"/>
+      <w:numFmt w:val="bullet"/>
+      <w:lvlText w:val=""/>
+      <w:lvlJc w:val="left"/>
+      <w:pPr>
+        <w:tabs>
+          <w:tab w:val="num" w:pos="3600"/>
+        </w:tabs>
+        <w:ind w:left="3600" w:hanging="360"/>
+      </w:pPr>
+      <w:rPr>
+        <w:rFonts w:ascii="Wingdings" w:hAnsi="Wingdings" w:hint="default"/>
+        <w:sz w:val="20"/>
+      </w:rPr>
+    </w:lvl>
+    <w:lvl w:ilvl="5" w:tentative="1">
+      <w:start w:val="1"/>
+      <w:numFmt w:val="bullet"/>
+      <w:lvlText w:val=""/>
+      <w:lvlJc w:val="left"/>
+      <w:pPr>
+        <w:tabs>
+          <w:tab w:val="num" w:pos="4320"/>
+        </w:tabs>
+        <w:ind w:left="4320" w:hanging="360"/>
+      </w:pPr>
+      <w:rPr>
+        <w:rFonts w:ascii="Wingdings" w:hAnsi="Wingdings" w:hint="default"/>
+        <w:sz w:val="20"/>
+      </w:rPr>
+    </w:lvl>
+    <w:lvl w:ilvl="6" w:tentative="1">
+      <w:start w:val="1"/>
+      <w:numFmt w:val="bullet"/>
+      <w:lvlText w:val=""/>
+      <w:lvlJc w:val="left"/>
+      <w:pPr>
+        <w:tabs>
+          <w:tab w:val="num" w:pos="5040"/>
+        </w:tabs>
+        <w:ind w:left="5040" w:hanging="360"/>
+      </w:pPr>
+      <w:rPr>
+        <w:rFonts w:ascii="Wingdings" w:hAnsi="Wingdings" w:hint="default"/>
+        <w:sz w:val="20"/>
+      </w:rPr>
+    </w:lvl>
+    <w:lvl w:ilvl="7" w:tentative="1">
+      <w:start w:val="1"/>
+      <w:numFmt w:val="bullet"/>
+      <w:lvlText w:val=""/>
+      <w:lvlJc w:val="left"/>
+      <w:pPr>
+        <w:tabs>
+          <w:tab w:val="num" w:pos="5760"/>
+        </w:tabs>
+        <w:ind w:left="5760" w:hanging="360"/>
+      </w:pPr>
+      <w:rPr>
+        <w:rFonts w:ascii="Wingdings" w:hAnsi="Wingdings" w:hint="default"/>
+        <w:sz w:val="20"/>
+      </w:rPr>
+    </w:lvl>
+    <w:lvl w:ilvl="8" w:tentative="1">
+      <w:start w:val="1"/>
+      <w:numFmt w:val="bullet"/>
+      <w:lvlText w:val=""/>
+      <w:lvlJc w:val="left"/>
+      <w:pPr>
+        <w:tabs>
+          <w:tab w:val="num" w:pos="6480"/>
+        </w:tabs>
+        <w:ind w:left="6480" w:hanging="360"/>
+      </w:pPr>
+      <w:rPr>
+        <w:rFonts w:ascii="Wingdings" w:hAnsi="Wingdings" w:hint="default"/>
+        <w:sz w:val="20"/>
+      </w:rPr>
+    </w:lvl>
+  </w:abstractNum>
+  <w:abstractNum w:abstractNumId="4" w15:restartNumberingAfterBreak="0">
+    <w:nsid w:val="1194080C"/>
+    <w:multiLevelType w:val="multilevel"/>
+    <w:tmpl w:val="CF2EA852"/>
+    <w:lvl w:ilvl="0">
+      <w:start w:val="1"/>
+      <w:numFmt w:val="bullet"/>
+      <w:lvlText w:val=""/>
+      <w:lvlJc w:val="left"/>
+      <w:pPr>
+        <w:tabs>
+          <w:tab w:val="num" w:pos="720"/>
+        </w:tabs>
+        <w:ind w:left="720" w:hanging="360"/>
+      </w:pPr>
+      <w:rPr>
+        <w:rFonts w:ascii="Symbol" w:hAnsi="Symbol" w:hint="default"/>
+        <w:sz w:val="20"/>
+      </w:rPr>
+    </w:lvl>
+    <w:lvl w:ilvl="1" w:tentative="1">
+      <w:start w:val="1"/>
+      <w:numFmt w:val="bullet"/>
+      <w:lvlText w:val="o"/>
+      <w:lvlJc w:val="left"/>
+      <w:pPr>
+        <w:tabs>
+          <w:tab w:val="num" w:pos="1440"/>
+        </w:tabs>
+        <w:ind w:left="1440" w:hanging="360"/>
+      </w:pPr>
+      <w:rPr>
+        <w:rFonts w:ascii="Courier New" w:hAnsi="Courier New" w:hint="default"/>
+        <w:sz w:val="20"/>
+      </w:rPr>
+    </w:lvl>
+    <w:lvl w:ilvl="2" w:tentative="1">
+      <w:start w:val="1"/>
+      <w:numFmt w:val="bullet"/>
+      <w:lvlText w:val=""/>
+      <w:lvlJc w:val="left"/>
+      <w:pPr>
+        <w:tabs>
+          <w:tab w:val="num" w:pos="2160"/>
+        </w:tabs>
+        <w:ind w:left="2160" w:hanging="360"/>
+      </w:pPr>
+      <w:rPr>
+        <w:rFonts w:ascii="Wingdings" w:hAnsi="Wingdings" w:hint="default"/>
+        <w:sz w:val="20"/>
+      </w:rPr>
+    </w:lvl>
+    <w:lvl w:ilvl="3" w:tentative="1">
+      <w:start w:val="1"/>
+      <w:numFmt w:val="bullet"/>
+      <w:lvlText w:val=""/>
+      <w:lvlJc w:val="left"/>
+      <w:pPr>
+        <w:tabs>
+          <w:tab w:val="num" w:pos="2880"/>
+        </w:tabs>
+        <w:ind w:left="2880" w:hanging="360"/>
+      </w:pPr>
+      <w:rPr>
+        <w:rFonts w:ascii="Wingdings" w:hAnsi="Wingdings" w:hint="default"/>
+        <w:sz w:val="20"/>
+      </w:rPr>
+    </w:lvl>
+    <w:lvl w:ilvl="4" w:tentative="1">
+      <w:start w:val="1"/>
+      <w:numFmt w:val="bullet"/>
+      <w:lvlText w:val=""/>
+      <w:lvlJc w:val="left"/>
+      <w:pPr>
+        <w:tabs>
+          <w:tab w:val="num" w:pos="3600"/>
+        </w:tabs>
+        <w:ind w:left="3600" w:hanging="360"/>
+      </w:pPr>
+      <w:rPr>
+        <w:rFonts w:ascii="Wingdings" w:hAnsi="Wingdings" w:hint="default"/>
+        <w:sz w:val="20"/>
+      </w:rPr>
+    </w:lvl>
+    <w:lvl w:ilvl="5" w:tentative="1">
+      <w:start w:val="1"/>
+      <w:numFmt w:val="bullet"/>
+      <w:lvlText w:val=""/>
+      <w:lvlJc w:val="left"/>
+      <w:pPr>
+        <w:tabs>
+          <w:tab w:val="num" w:pos="4320"/>
+        </w:tabs>
+        <w:ind w:left="4320" w:hanging="360"/>
+      </w:pPr>
+      <w:rPr>
+        <w:rFonts w:ascii="Wingdings" w:hAnsi="Wingdings" w:hint="default"/>
+        <w:sz w:val="20"/>
+      </w:rPr>
+    </w:lvl>
+    <w:lvl w:ilvl="6" w:tentative="1">
+      <w:start w:val="1"/>
+      <w:numFmt w:val="bullet"/>
+      <w:lvlText w:val=""/>
+      <w:lvlJc w:val="left"/>
+      <w:pPr>
+        <w:tabs>
+          <w:tab w:val="num" w:pos="5040"/>
+        </w:tabs>
+        <w:ind w:left="5040" w:hanging="360"/>
+      </w:pPr>
+      <w:rPr>
+        <w:rFonts w:ascii="Wingdings" w:hAnsi="Wingdings" w:hint="default"/>
+        <w:sz w:val="20"/>
+      </w:rPr>
+    </w:lvl>
+    <w:lvl w:ilvl="7" w:tentative="1">
+      <w:start w:val="1"/>
+      <w:numFmt w:val="bullet"/>
+      <w:lvlText w:val=""/>
+      <w:lvlJc w:val="left"/>
+      <w:pPr>
+        <w:tabs>
+          <w:tab w:val="num" w:pos="5760"/>
+        </w:tabs>
+        <w:ind w:left="5760" w:hanging="360"/>
+      </w:pPr>
+      <w:rPr>
+        <w:rFonts w:ascii="Wingdings" w:hAnsi="Wingdings" w:hint="default"/>
+        <w:sz w:val="20"/>
+      </w:rPr>
+    </w:lvl>
+    <w:lvl w:ilvl="8" w:tentative="1">
+      <w:start w:val="1"/>
+      <w:numFmt w:val="bullet"/>
+      <w:lvlText w:val=""/>
+      <w:lvlJc w:val="left"/>
+      <w:pPr>
+        <w:tabs>
+          <w:tab w:val="num" w:pos="6480"/>
+        </w:tabs>
+        <w:ind w:left="6480" w:hanging="360"/>
+      </w:pPr>
+      <w:rPr>
+        <w:rFonts w:ascii="Wingdings" w:hAnsi="Wingdings" w:hint="default"/>
+        <w:sz w:val="20"/>
+      </w:rPr>
+    </w:lvl>
+  </w:abstractNum>
+  <w:abstractNum w:abstractNumId="5" w15:restartNumberingAfterBreak="0">
+    <w:nsid w:val="1C1A4A14"/>
+    <w:multiLevelType w:val="multilevel"/>
+    <w:tmpl w:val="35D46DE0"/>
+    <w:lvl w:ilvl="0">
+      <w:start w:val="1"/>
+      <w:numFmt w:val="bullet"/>
+      <w:lvlText w:val=""/>
+      <w:lvlJc w:val="left"/>
+      <w:pPr>
+        <w:tabs>
+          <w:tab w:val="num" w:pos="720"/>
+        </w:tabs>
+        <w:ind w:left="720" w:hanging="360"/>
+      </w:pPr>
+      <w:rPr>
+        <w:rFonts w:ascii="Symbol" w:hAnsi="Symbol" w:hint="default"/>
+        <w:sz w:val="20"/>
+      </w:rPr>
+    </w:lvl>
+    <w:lvl w:ilvl="1" w:tentative="1">
+      <w:start w:val="1"/>
+      <w:numFmt w:val="bullet"/>
+      <w:lvlText w:val="o"/>
+      <w:lvlJc w:val="left"/>
+      <w:pPr>
+        <w:tabs>
+          <w:tab w:val="num" w:pos="1440"/>
+        </w:tabs>
+        <w:ind w:left="1440" w:hanging="360"/>
+      </w:pPr>
+      <w:rPr>
+        <w:rFonts w:ascii="Courier New" w:hAnsi="Courier New" w:hint="default"/>
+        <w:sz w:val="20"/>
+      </w:rPr>
+    </w:lvl>
+    <w:lvl w:ilvl="2" w:tentative="1">
+      <w:start w:val="1"/>
+      <w:numFmt w:val="bullet"/>
+      <w:lvlText w:val=""/>
+      <w:lvlJc w:val="left"/>
+      <w:pPr>
+        <w:tabs>
+          <w:tab w:val="num" w:pos="2160"/>
+        </w:tabs>
+        <w:ind w:left="2160" w:hanging="360"/>
+      </w:pPr>
+      <w:rPr>
+        <w:rFonts w:ascii="Wingdings" w:hAnsi="Wingdings" w:hint="default"/>
+        <w:sz w:val="20"/>
+      </w:rPr>
+    </w:lvl>
+    <w:lvl w:ilvl="3" w:tentative="1">
+      <w:start w:val="1"/>
+      <w:numFmt w:val="bullet"/>
+      <w:lvlText w:val=""/>
+      <w:lvlJc w:val="left"/>
+      <w:pPr>
+        <w:tabs>
+          <w:tab w:val="num" w:pos="2880"/>
+        </w:tabs>
+        <w:ind w:left="2880" w:hanging="360"/>
+      </w:pPr>
+      <w:rPr>
+        <w:rFonts w:ascii="Wingdings" w:hAnsi="Wingdings" w:hint="default"/>
+        <w:sz w:val="20"/>
+      </w:rPr>
+    </w:lvl>
+    <w:lvl w:ilvl="4" w:tentative="1">
+      <w:start w:val="1"/>
+      <w:numFmt w:val="bullet"/>
+      <w:lvlText w:val=""/>
+      <w:lvlJc w:val="left"/>
+      <w:pPr>
+        <w:tabs>
+          <w:tab w:val="num" w:pos="3600"/>
+        </w:tabs>
+        <w:ind w:left="3600" w:hanging="360"/>
+      </w:pPr>
+      <w:rPr>
+        <w:rFonts w:ascii="Wingdings" w:hAnsi="Wingdings" w:hint="default"/>
+        <w:sz w:val="20"/>
+      </w:rPr>
+    </w:lvl>
+    <w:lvl w:ilvl="5" w:tentative="1">
+      <w:start w:val="1"/>
+      <w:numFmt w:val="bullet"/>
+      <w:lvlText w:val=""/>
+      <w:lvlJc w:val="left"/>
+      <w:pPr>
+        <w:tabs>
+          <w:tab w:val="num" w:pos="4320"/>
+        </w:tabs>
+        <w:ind w:left="4320" w:hanging="360"/>
+      </w:pPr>
+      <w:rPr>
+        <w:rFonts w:ascii="Wingdings" w:hAnsi="Wingdings" w:hint="default"/>
+        <w:sz w:val="20"/>
+      </w:rPr>
+    </w:lvl>
+    <w:lvl w:ilvl="6" w:tentative="1">
+      <w:start w:val="1"/>
+      <w:numFmt w:val="bullet"/>
+      <w:lvlText w:val=""/>
+      <w:lvlJc w:val="left"/>
+      <w:pPr>
+        <w:tabs>
+          <w:tab w:val="num" w:pos="5040"/>
+        </w:tabs>
+        <w:ind w:left="5040" w:hanging="360"/>
+      </w:pPr>
+      <w:rPr>
+        <w:rFonts w:ascii="Wingdings" w:hAnsi="Wingdings" w:hint="default"/>
+        <w:sz w:val="20"/>
+      </w:rPr>
+    </w:lvl>
+    <w:lvl w:ilvl="7" w:tentative="1">
+      <w:start w:val="1"/>
+      <w:numFmt w:val="bullet"/>
+      <w:lvlText w:val=""/>
+      <w:lvlJc w:val="left"/>
+      <w:pPr>
+        <w:tabs>
+          <w:tab w:val="num" w:pos="5760"/>
+        </w:tabs>
+        <w:ind w:left="5760" w:hanging="360"/>
+      </w:pPr>
+      <w:rPr>
+        <w:rFonts w:ascii="Wingdings" w:hAnsi="Wingdings" w:hint="default"/>
+        <w:sz w:val="20"/>
+      </w:rPr>
+    </w:lvl>
+    <w:lvl w:ilvl="8" w:tentative="1">
+      <w:start w:val="1"/>
+      <w:numFmt w:val="bullet"/>
+      <w:lvlText w:val=""/>
+      <w:lvlJc w:val="left"/>
+      <w:pPr>
+        <w:tabs>
+          <w:tab w:val="num" w:pos="6480"/>
+        </w:tabs>
+        <w:ind w:left="6480" w:hanging="360"/>
+      </w:pPr>
+      <w:rPr>
+        <w:rFonts w:ascii="Wingdings" w:hAnsi="Wingdings" w:hint="default"/>
+        <w:sz w:val="20"/>
+      </w:rPr>
+    </w:lvl>
+  </w:abstractNum>
+  <w:abstractNum w:abstractNumId="6" w15:restartNumberingAfterBreak="0">
     <w:nsid w:val="29D04F18"/>
     <w:multiLevelType w:val="multilevel"/>
     <w:tmpl w:val="26807758"/>
@@ -1929,7 +2460,7 @@
       </w:rPr>
     </w:lvl>
   </w:abstractNum>
-  <w:abstractNum w:abstractNumId="4" w15:restartNumberingAfterBreak="0">
+  <w:abstractNum w:abstractNumId="7" w15:restartNumberingAfterBreak="0">
     <w:nsid w:val="3EDF33B6"/>
     <w:multiLevelType w:val="multilevel"/>
     <w:tmpl w:val="1610D26C"/>
@@ -2078,7 +2609,7 @@
       </w:rPr>
     </w:lvl>
   </w:abstractNum>
-  <w:abstractNum w:abstractNumId="5" w15:restartNumberingAfterBreak="0">
+  <w:abstractNum w:abstractNumId="8" w15:restartNumberingAfterBreak="0">
     <w:nsid w:val="448D278C"/>
     <w:multiLevelType w:val="multilevel"/>
     <w:tmpl w:val="BA76F400"/>
@@ -2227,11 +2758,607 @@
       </w:rPr>
     </w:lvl>
   </w:abstractNum>
+  <w:abstractNum w:abstractNumId="9" w15:restartNumberingAfterBreak="0">
+    <w:nsid w:val="5D7B09B5"/>
+    <w:multiLevelType w:val="multilevel"/>
+    <w:tmpl w:val="50C89D18"/>
+    <w:lvl w:ilvl="0">
+      <w:start w:val="1"/>
+      <w:numFmt w:val="bullet"/>
+      <w:lvlText w:val=""/>
+      <w:lvlJc w:val="left"/>
+      <w:pPr>
+        <w:tabs>
+          <w:tab w:val="num" w:pos="720"/>
+        </w:tabs>
+        <w:ind w:left="720" w:hanging="360"/>
+      </w:pPr>
+      <w:rPr>
+        <w:rFonts w:ascii="Symbol" w:hAnsi="Symbol" w:hint="default"/>
+        <w:sz w:val="20"/>
+      </w:rPr>
+    </w:lvl>
+    <w:lvl w:ilvl="1" w:tentative="1">
+      <w:start w:val="1"/>
+      <w:numFmt w:val="bullet"/>
+      <w:lvlText w:val="o"/>
+      <w:lvlJc w:val="left"/>
+      <w:pPr>
+        <w:tabs>
+          <w:tab w:val="num" w:pos="1440"/>
+        </w:tabs>
+        <w:ind w:left="1440" w:hanging="360"/>
+      </w:pPr>
+      <w:rPr>
+        <w:rFonts w:ascii="Courier New" w:hAnsi="Courier New" w:hint="default"/>
+        <w:sz w:val="20"/>
+      </w:rPr>
+    </w:lvl>
+    <w:lvl w:ilvl="2" w:tentative="1">
+      <w:start w:val="1"/>
+      <w:numFmt w:val="bullet"/>
+      <w:lvlText w:val=""/>
+      <w:lvlJc w:val="left"/>
+      <w:pPr>
+        <w:tabs>
+          <w:tab w:val="num" w:pos="2160"/>
+        </w:tabs>
+        <w:ind w:left="2160" w:hanging="360"/>
+      </w:pPr>
+      <w:rPr>
+        <w:rFonts w:ascii="Wingdings" w:hAnsi="Wingdings" w:hint="default"/>
+        <w:sz w:val="20"/>
+      </w:rPr>
+    </w:lvl>
+    <w:lvl w:ilvl="3" w:tentative="1">
+      <w:start w:val="1"/>
+      <w:numFmt w:val="bullet"/>
+      <w:lvlText w:val=""/>
+      <w:lvlJc w:val="left"/>
+      <w:pPr>
+        <w:tabs>
+          <w:tab w:val="num" w:pos="2880"/>
+        </w:tabs>
+        <w:ind w:left="2880" w:hanging="360"/>
+      </w:pPr>
+      <w:rPr>
+        <w:rFonts w:ascii="Wingdings" w:hAnsi="Wingdings" w:hint="default"/>
+        <w:sz w:val="20"/>
+      </w:rPr>
+    </w:lvl>
+    <w:lvl w:ilvl="4" w:tentative="1">
+      <w:start w:val="1"/>
+      <w:numFmt w:val="bullet"/>
+      <w:lvlText w:val=""/>
+      <w:lvlJc w:val="left"/>
+      <w:pPr>
+        <w:tabs>
+          <w:tab w:val="num" w:pos="3600"/>
+        </w:tabs>
+        <w:ind w:left="3600" w:hanging="360"/>
+      </w:pPr>
+      <w:rPr>
+        <w:rFonts w:ascii="Wingdings" w:hAnsi="Wingdings" w:hint="default"/>
+        <w:sz w:val="20"/>
+      </w:rPr>
+    </w:lvl>
+    <w:lvl w:ilvl="5" w:tentative="1">
+      <w:start w:val="1"/>
+      <w:numFmt w:val="bullet"/>
+      <w:lvlText w:val=""/>
+      <w:lvlJc w:val="left"/>
+      <w:pPr>
+        <w:tabs>
+          <w:tab w:val="num" w:pos="4320"/>
+        </w:tabs>
+        <w:ind w:left="4320" w:hanging="360"/>
+      </w:pPr>
+      <w:rPr>
+        <w:rFonts w:ascii="Wingdings" w:hAnsi="Wingdings" w:hint="default"/>
+        <w:sz w:val="20"/>
+      </w:rPr>
+    </w:lvl>
+    <w:lvl w:ilvl="6" w:tentative="1">
+      <w:start w:val="1"/>
+      <w:numFmt w:val="bullet"/>
+      <w:lvlText w:val=""/>
+      <w:lvlJc w:val="left"/>
+      <w:pPr>
+        <w:tabs>
+          <w:tab w:val="num" w:pos="5040"/>
+        </w:tabs>
+        <w:ind w:left="5040" w:hanging="360"/>
+      </w:pPr>
+      <w:rPr>
+        <w:rFonts w:ascii="Wingdings" w:hAnsi="Wingdings" w:hint="default"/>
+        <w:sz w:val="20"/>
+      </w:rPr>
+    </w:lvl>
+    <w:lvl w:ilvl="7" w:tentative="1">
+      <w:start w:val="1"/>
+      <w:numFmt w:val="bullet"/>
+      <w:lvlText w:val=""/>
+      <w:lvlJc w:val="left"/>
+      <w:pPr>
+        <w:tabs>
+          <w:tab w:val="num" w:pos="5760"/>
+        </w:tabs>
+        <w:ind w:left="5760" w:hanging="360"/>
+      </w:pPr>
+      <w:rPr>
+        <w:rFonts w:ascii="Wingdings" w:hAnsi="Wingdings" w:hint="default"/>
+        <w:sz w:val="20"/>
+      </w:rPr>
+    </w:lvl>
+    <w:lvl w:ilvl="8" w:tentative="1">
+      <w:start w:val="1"/>
+      <w:numFmt w:val="bullet"/>
+      <w:lvlText w:val=""/>
+      <w:lvlJc w:val="left"/>
+      <w:pPr>
+        <w:tabs>
+          <w:tab w:val="num" w:pos="6480"/>
+        </w:tabs>
+        <w:ind w:left="6480" w:hanging="360"/>
+      </w:pPr>
+      <w:rPr>
+        <w:rFonts w:ascii="Wingdings" w:hAnsi="Wingdings" w:hint="default"/>
+        <w:sz w:val="20"/>
+      </w:rPr>
+    </w:lvl>
+  </w:abstractNum>
+  <w:abstractNum w:abstractNumId="10" w15:restartNumberingAfterBreak="0">
+    <w:nsid w:val="5E8B4DEB"/>
+    <w:multiLevelType w:val="multilevel"/>
+    <w:tmpl w:val="E14811A2"/>
+    <w:lvl w:ilvl="0">
+      <w:start w:val="1"/>
+      <w:numFmt w:val="bullet"/>
+      <w:lvlText w:val=""/>
+      <w:lvlJc w:val="left"/>
+      <w:pPr>
+        <w:tabs>
+          <w:tab w:val="num" w:pos="720"/>
+        </w:tabs>
+        <w:ind w:left="720" w:hanging="360"/>
+      </w:pPr>
+      <w:rPr>
+        <w:rFonts w:ascii="Symbol" w:hAnsi="Symbol" w:hint="default"/>
+        <w:sz w:val="20"/>
+      </w:rPr>
+    </w:lvl>
+    <w:lvl w:ilvl="1" w:tentative="1">
+      <w:start w:val="1"/>
+      <w:numFmt w:val="bullet"/>
+      <w:lvlText w:val="o"/>
+      <w:lvlJc w:val="left"/>
+      <w:pPr>
+        <w:tabs>
+          <w:tab w:val="num" w:pos="1440"/>
+        </w:tabs>
+        <w:ind w:left="1440" w:hanging="360"/>
+      </w:pPr>
+      <w:rPr>
+        <w:rFonts w:ascii="Courier New" w:hAnsi="Courier New" w:hint="default"/>
+        <w:sz w:val="20"/>
+      </w:rPr>
+    </w:lvl>
+    <w:lvl w:ilvl="2" w:tentative="1">
+      <w:start w:val="1"/>
+      <w:numFmt w:val="bullet"/>
+      <w:lvlText w:val=""/>
+      <w:lvlJc w:val="left"/>
+      <w:pPr>
+        <w:tabs>
+          <w:tab w:val="num" w:pos="2160"/>
+        </w:tabs>
+        <w:ind w:left="2160" w:hanging="360"/>
+      </w:pPr>
+      <w:rPr>
+        <w:rFonts w:ascii="Wingdings" w:hAnsi="Wingdings" w:hint="default"/>
+        <w:sz w:val="20"/>
+      </w:rPr>
+    </w:lvl>
+    <w:lvl w:ilvl="3" w:tentative="1">
+      <w:start w:val="1"/>
+      <w:numFmt w:val="bullet"/>
+      <w:lvlText w:val=""/>
+      <w:lvlJc w:val="left"/>
+      <w:pPr>
+        <w:tabs>
+          <w:tab w:val="num" w:pos="2880"/>
+        </w:tabs>
+        <w:ind w:left="2880" w:hanging="360"/>
+      </w:pPr>
+      <w:rPr>
+        <w:rFonts w:ascii="Wingdings" w:hAnsi="Wingdings" w:hint="default"/>
+        <w:sz w:val="20"/>
+      </w:rPr>
+    </w:lvl>
+    <w:lvl w:ilvl="4" w:tentative="1">
+      <w:start w:val="1"/>
+      <w:numFmt w:val="bullet"/>
+      <w:lvlText w:val=""/>
+      <w:lvlJc w:val="left"/>
+      <w:pPr>
+        <w:tabs>
+          <w:tab w:val="num" w:pos="3600"/>
+        </w:tabs>
+        <w:ind w:left="3600" w:hanging="360"/>
+      </w:pPr>
+      <w:rPr>
+        <w:rFonts w:ascii="Wingdings" w:hAnsi="Wingdings" w:hint="default"/>
+        <w:sz w:val="20"/>
+      </w:rPr>
+    </w:lvl>
+    <w:lvl w:ilvl="5" w:tentative="1">
+      <w:start w:val="1"/>
+      <w:numFmt w:val="bullet"/>
+      <w:lvlText w:val=""/>
+      <w:lvlJc w:val="left"/>
+      <w:pPr>
+        <w:tabs>
+          <w:tab w:val="num" w:pos="4320"/>
+        </w:tabs>
+        <w:ind w:left="4320" w:hanging="360"/>
+      </w:pPr>
+      <w:rPr>
+        <w:rFonts w:ascii="Wingdings" w:hAnsi="Wingdings" w:hint="default"/>
+        <w:sz w:val="20"/>
+      </w:rPr>
+    </w:lvl>
+    <w:lvl w:ilvl="6" w:tentative="1">
+      <w:start w:val="1"/>
+      <w:numFmt w:val="bullet"/>
+      <w:lvlText w:val=""/>
+      <w:lvlJc w:val="left"/>
+      <w:pPr>
+        <w:tabs>
+          <w:tab w:val="num" w:pos="5040"/>
+        </w:tabs>
+        <w:ind w:left="5040" w:hanging="360"/>
+      </w:pPr>
+      <w:rPr>
+        <w:rFonts w:ascii="Wingdings" w:hAnsi="Wingdings" w:hint="default"/>
+        <w:sz w:val="20"/>
+      </w:rPr>
+    </w:lvl>
+    <w:lvl w:ilvl="7" w:tentative="1">
+      <w:start w:val="1"/>
+      <w:numFmt w:val="bullet"/>
+      <w:lvlText w:val=""/>
+      <w:lvlJc w:val="left"/>
+      <w:pPr>
+        <w:tabs>
+          <w:tab w:val="num" w:pos="5760"/>
+        </w:tabs>
+        <w:ind w:left="5760" w:hanging="360"/>
+      </w:pPr>
+      <w:rPr>
+        <w:rFonts w:ascii="Wingdings" w:hAnsi="Wingdings" w:hint="default"/>
+        <w:sz w:val="20"/>
+      </w:rPr>
+    </w:lvl>
+    <w:lvl w:ilvl="8" w:tentative="1">
+      <w:start w:val="1"/>
+      <w:numFmt w:val="bullet"/>
+      <w:lvlText w:val=""/>
+      <w:lvlJc w:val="left"/>
+      <w:pPr>
+        <w:tabs>
+          <w:tab w:val="num" w:pos="6480"/>
+        </w:tabs>
+        <w:ind w:left="6480" w:hanging="360"/>
+      </w:pPr>
+      <w:rPr>
+        <w:rFonts w:ascii="Wingdings" w:hAnsi="Wingdings" w:hint="default"/>
+        <w:sz w:val="20"/>
+      </w:rPr>
+    </w:lvl>
+  </w:abstractNum>
+  <w:abstractNum w:abstractNumId="11" w15:restartNumberingAfterBreak="0">
+    <w:nsid w:val="76D6486F"/>
+    <w:multiLevelType w:val="multilevel"/>
+    <w:tmpl w:val="3184DBF8"/>
+    <w:lvl w:ilvl="0">
+      <w:start w:val="1"/>
+      <w:numFmt w:val="bullet"/>
+      <w:lvlText w:val=""/>
+      <w:lvlJc w:val="left"/>
+      <w:pPr>
+        <w:tabs>
+          <w:tab w:val="num" w:pos="720"/>
+        </w:tabs>
+        <w:ind w:left="720" w:hanging="360"/>
+      </w:pPr>
+      <w:rPr>
+        <w:rFonts w:ascii="Symbol" w:hAnsi="Symbol" w:hint="default"/>
+        <w:sz w:val="20"/>
+      </w:rPr>
+    </w:lvl>
+    <w:lvl w:ilvl="1" w:tentative="1">
+      <w:start w:val="1"/>
+      <w:numFmt w:val="bullet"/>
+      <w:lvlText w:val="o"/>
+      <w:lvlJc w:val="left"/>
+      <w:pPr>
+        <w:tabs>
+          <w:tab w:val="num" w:pos="1440"/>
+        </w:tabs>
+        <w:ind w:left="1440" w:hanging="360"/>
+      </w:pPr>
+      <w:rPr>
+        <w:rFonts w:ascii="Courier New" w:hAnsi="Courier New" w:hint="default"/>
+        <w:sz w:val="20"/>
+      </w:rPr>
+    </w:lvl>
+    <w:lvl w:ilvl="2" w:tentative="1">
+      <w:start w:val="1"/>
+      <w:numFmt w:val="bullet"/>
+      <w:lvlText w:val=""/>
+      <w:lvlJc w:val="left"/>
+      <w:pPr>
+        <w:tabs>
+          <w:tab w:val="num" w:pos="2160"/>
+        </w:tabs>
+        <w:ind w:left="2160" w:hanging="360"/>
+      </w:pPr>
+      <w:rPr>
+        <w:rFonts w:ascii="Wingdings" w:hAnsi="Wingdings" w:hint="default"/>
+        <w:sz w:val="20"/>
+      </w:rPr>
+    </w:lvl>
+    <w:lvl w:ilvl="3" w:tentative="1">
+      <w:start w:val="1"/>
+      <w:numFmt w:val="bullet"/>
+      <w:lvlText w:val=""/>
+      <w:lvlJc w:val="left"/>
+      <w:pPr>
+        <w:tabs>
+          <w:tab w:val="num" w:pos="2880"/>
+        </w:tabs>
+        <w:ind w:left="2880" w:hanging="360"/>
+      </w:pPr>
+      <w:rPr>
+        <w:rFonts w:ascii="Wingdings" w:hAnsi="Wingdings" w:hint="default"/>
+        <w:sz w:val="20"/>
+      </w:rPr>
+    </w:lvl>
+    <w:lvl w:ilvl="4" w:tentative="1">
+      <w:start w:val="1"/>
+      <w:numFmt w:val="bullet"/>
+      <w:lvlText w:val=""/>
+      <w:lvlJc w:val="left"/>
+      <w:pPr>
+        <w:tabs>
+          <w:tab w:val="num" w:pos="3600"/>
+        </w:tabs>
+        <w:ind w:left="3600" w:hanging="360"/>
+      </w:pPr>
+      <w:rPr>
+        <w:rFonts w:ascii="Wingdings" w:hAnsi="Wingdings" w:hint="default"/>
+        <w:sz w:val="20"/>
+      </w:rPr>
+    </w:lvl>
+    <w:lvl w:ilvl="5" w:tentative="1">
+      <w:start w:val="1"/>
+      <w:numFmt w:val="bullet"/>
+      <w:lvlText w:val=""/>
+      <w:lvlJc w:val="left"/>
+      <w:pPr>
+        <w:tabs>
+          <w:tab w:val="num" w:pos="4320"/>
+        </w:tabs>
+        <w:ind w:left="4320" w:hanging="360"/>
+      </w:pPr>
+      <w:rPr>
+        <w:rFonts w:ascii="Wingdings" w:hAnsi="Wingdings" w:hint="default"/>
+        <w:sz w:val="20"/>
+      </w:rPr>
+    </w:lvl>
+    <w:lvl w:ilvl="6" w:tentative="1">
+      <w:start w:val="1"/>
+      <w:numFmt w:val="bullet"/>
+      <w:lvlText w:val=""/>
+      <w:lvlJc w:val="left"/>
+      <w:pPr>
+        <w:tabs>
+          <w:tab w:val="num" w:pos="5040"/>
+        </w:tabs>
+        <w:ind w:left="5040" w:hanging="360"/>
+      </w:pPr>
+      <w:rPr>
+        <w:rFonts w:ascii="Wingdings" w:hAnsi="Wingdings" w:hint="default"/>
+        <w:sz w:val="20"/>
+      </w:rPr>
+    </w:lvl>
+    <w:lvl w:ilvl="7" w:tentative="1">
+      <w:start w:val="1"/>
+      <w:numFmt w:val="bullet"/>
+      <w:lvlText w:val=""/>
+      <w:lvlJc w:val="left"/>
+      <w:pPr>
+        <w:tabs>
+          <w:tab w:val="num" w:pos="5760"/>
+        </w:tabs>
+        <w:ind w:left="5760" w:hanging="360"/>
+      </w:pPr>
+      <w:rPr>
+        <w:rFonts w:ascii="Wingdings" w:hAnsi="Wingdings" w:hint="default"/>
+        <w:sz w:val="20"/>
+      </w:rPr>
+    </w:lvl>
+    <w:lvl w:ilvl="8" w:tentative="1">
+      <w:start w:val="1"/>
+      <w:numFmt w:val="bullet"/>
+      <w:lvlText w:val=""/>
+      <w:lvlJc w:val="left"/>
+      <w:pPr>
+        <w:tabs>
+          <w:tab w:val="num" w:pos="6480"/>
+        </w:tabs>
+        <w:ind w:left="6480" w:hanging="360"/>
+      </w:pPr>
+      <w:rPr>
+        <w:rFonts w:ascii="Wingdings" w:hAnsi="Wingdings" w:hint="default"/>
+        <w:sz w:val="20"/>
+      </w:rPr>
+    </w:lvl>
+  </w:abstractNum>
+  <w:abstractNum w:abstractNumId="12" w15:restartNumberingAfterBreak="0">
+    <w:nsid w:val="77500567"/>
+    <w:multiLevelType w:val="multilevel"/>
+    <w:tmpl w:val="CF38486E"/>
+    <w:lvl w:ilvl="0">
+      <w:start w:val="1"/>
+      <w:numFmt w:val="bullet"/>
+      <w:lvlText w:val=""/>
+      <w:lvlJc w:val="left"/>
+      <w:pPr>
+        <w:tabs>
+          <w:tab w:val="num" w:pos="720"/>
+        </w:tabs>
+        <w:ind w:left="720" w:hanging="360"/>
+      </w:pPr>
+      <w:rPr>
+        <w:rFonts w:ascii="Symbol" w:hAnsi="Symbol" w:hint="default"/>
+        <w:sz w:val="20"/>
+      </w:rPr>
+    </w:lvl>
+    <w:lvl w:ilvl="1" w:tentative="1">
+      <w:start w:val="1"/>
+      <w:numFmt w:val="bullet"/>
+      <w:lvlText w:val="o"/>
+      <w:lvlJc w:val="left"/>
+      <w:pPr>
+        <w:tabs>
+          <w:tab w:val="num" w:pos="1440"/>
+        </w:tabs>
+        <w:ind w:left="1440" w:hanging="360"/>
+      </w:pPr>
+      <w:rPr>
+        <w:rFonts w:ascii="Courier New" w:hAnsi="Courier New" w:hint="default"/>
+        <w:sz w:val="20"/>
+      </w:rPr>
+    </w:lvl>
+    <w:lvl w:ilvl="2" w:tentative="1">
+      <w:start w:val="1"/>
+      <w:numFmt w:val="bullet"/>
+      <w:lvlText w:val=""/>
+      <w:lvlJc w:val="left"/>
+      <w:pPr>
+        <w:tabs>
+          <w:tab w:val="num" w:pos="2160"/>
+        </w:tabs>
+        <w:ind w:left="2160" w:hanging="360"/>
+      </w:pPr>
+      <w:rPr>
+        <w:rFonts w:ascii="Wingdings" w:hAnsi="Wingdings" w:hint="default"/>
+        <w:sz w:val="20"/>
+      </w:rPr>
+    </w:lvl>
+    <w:lvl w:ilvl="3" w:tentative="1">
+      <w:start w:val="1"/>
+      <w:numFmt w:val="bullet"/>
+      <w:lvlText w:val=""/>
+      <w:lvlJc w:val="left"/>
+      <w:pPr>
+        <w:tabs>
+          <w:tab w:val="num" w:pos="2880"/>
+        </w:tabs>
+        <w:ind w:left="2880" w:hanging="360"/>
+      </w:pPr>
+      <w:rPr>
+        <w:rFonts w:ascii="Wingdings" w:hAnsi="Wingdings" w:hint="default"/>
+        <w:sz w:val="20"/>
+      </w:rPr>
+    </w:lvl>
+    <w:lvl w:ilvl="4" w:tentative="1">
+      <w:start w:val="1"/>
+      <w:numFmt w:val="bullet"/>
+      <w:lvlText w:val=""/>
+      <w:lvlJc w:val="left"/>
+      <w:pPr>
+        <w:tabs>
+          <w:tab w:val="num" w:pos="3600"/>
+        </w:tabs>
+        <w:ind w:left="3600" w:hanging="360"/>
+      </w:pPr>
+      <w:rPr>
+        <w:rFonts w:ascii="Wingdings" w:hAnsi="Wingdings" w:hint="default"/>
+        <w:sz w:val="20"/>
+      </w:rPr>
+    </w:lvl>
+    <w:lvl w:ilvl="5" w:tentative="1">
+      <w:start w:val="1"/>
+      <w:numFmt w:val="bullet"/>
+      <w:lvlText w:val=""/>
+      <w:lvlJc w:val="left"/>
+      <w:pPr>
+        <w:tabs>
+          <w:tab w:val="num" w:pos="4320"/>
+        </w:tabs>
+        <w:ind w:left="4320" w:hanging="360"/>
+      </w:pPr>
+      <w:rPr>
+        <w:rFonts w:ascii="Wingdings" w:hAnsi="Wingdings" w:hint="default"/>
+        <w:sz w:val="20"/>
+      </w:rPr>
+    </w:lvl>
+    <w:lvl w:ilvl="6" w:tentative="1">
+      <w:start w:val="1"/>
+      <w:numFmt w:val="bullet"/>
+      <w:lvlText w:val=""/>
+      <w:lvlJc w:val="left"/>
+      <w:pPr>
+        <w:tabs>
+          <w:tab w:val="num" w:pos="5040"/>
+        </w:tabs>
+        <w:ind w:left="5040" w:hanging="360"/>
+      </w:pPr>
+      <w:rPr>
+        <w:rFonts w:ascii="Wingdings" w:hAnsi="Wingdings" w:hint="default"/>
+        <w:sz w:val="20"/>
+      </w:rPr>
+    </w:lvl>
+    <w:lvl w:ilvl="7" w:tentative="1">
+      <w:start w:val="1"/>
+      <w:numFmt w:val="bullet"/>
+      <w:lvlText w:val=""/>
+      <w:lvlJc w:val="left"/>
+      <w:pPr>
+        <w:tabs>
+          <w:tab w:val="num" w:pos="5760"/>
+        </w:tabs>
+        <w:ind w:left="5760" w:hanging="360"/>
+      </w:pPr>
+      <w:rPr>
+        <w:rFonts w:ascii="Wingdings" w:hAnsi="Wingdings" w:hint="default"/>
+        <w:sz w:val="20"/>
+      </w:rPr>
+    </w:lvl>
+    <w:lvl w:ilvl="8" w:tentative="1">
+      <w:start w:val="1"/>
+      <w:numFmt w:val="bullet"/>
+      <w:lvlText w:val=""/>
+      <w:lvlJc w:val="left"/>
+      <w:pPr>
+        <w:tabs>
+          <w:tab w:val="num" w:pos="6480"/>
+        </w:tabs>
+        <w:ind w:left="6480" w:hanging="360"/>
+      </w:pPr>
+      <w:rPr>
+        <w:rFonts w:ascii="Wingdings" w:hAnsi="Wingdings" w:hint="default"/>
+        <w:sz w:val="20"/>
+      </w:rPr>
+    </w:lvl>
+  </w:abstractNum>
   <w:num w:numId="1">
-    <w:abstractNumId w:val="5"/>
+    <w:abstractNumId w:val="8"/>
   </w:num>
   <w:num w:numId="2">
-    <w:abstractNumId w:val="3"/>
+    <w:abstractNumId w:val="6"/>
   </w:num>
   <w:num w:numId="3">
     <w:abstractNumId w:val="0"/>
@@ -2243,7 +3370,28 @@
     <w:abstractNumId w:val="1"/>
   </w:num>
   <w:num w:numId="6">
+    <w:abstractNumId w:val="7"/>
+  </w:num>
+  <w:num w:numId="7">
+    <w:abstractNumId w:val="12"/>
+  </w:num>
+  <w:num w:numId="8">
     <w:abstractNumId w:val="4"/>
+  </w:num>
+  <w:num w:numId="9">
+    <w:abstractNumId w:val="9"/>
+  </w:num>
+  <w:num w:numId="10">
+    <w:abstractNumId w:val="3"/>
+  </w:num>
+  <w:num w:numId="11">
+    <w:abstractNumId w:val="5"/>
+  </w:num>
+  <w:num w:numId="12">
+    <w:abstractNumId w:val="10"/>
+  </w:num>
+  <w:num w:numId="13">
+    <w:abstractNumId w:val="11"/>
   </w:num>
 </w:numbering>
 </file>
@@ -2824,6 +3972,19 @@
       <w:iCs/>
     </w:rPr>
   </w:style>
+  <w:style w:type="paragraph" w:customStyle="1" w:styleId="pdq2pgselectionanchorcontainer">
+    <w:name w:val="pdq2pg_selectionanchorcontainer"/>
+    <w:basedOn w:val="Normal"/>
+    <w:rsid w:val="007F3278"/>
+    <w:pPr>
+      <w:spacing w:before="100" w:beforeAutospacing="1" w:after="100" w:afterAutospacing="1" w:line="240" w:lineRule="auto"/>
+    </w:pPr>
+    <w:rPr>
+      <w:rFonts w:ascii="Times New Roman" w:eastAsia="Times New Roman" w:hAnsi="Times New Roman" w:cs="Times New Roman"/>
+      <w:sz w:val="24"/>
+      <w:szCs w:val="24"/>
+    </w:rPr>
+  </w:style>
 </w:styles>
 </file>
 

</xml_diff>